<commit_message>
ok fixed up to 6 wiht all homeworks and activites and such
</commit_message>
<xml_diff>
--- a/docs/homeworks/hw_01/01_homework.docx
+++ b/docs/homeworks/hw_01/01_homework.docx
@@ -7,7 +7,15 @@
         <w:pStyle w:val="Title"/>
       </w:pPr>
       <w:r>
-        <w:t xml:space="preserve">01_Homework</w:t>
+        <w:t xml:space="preserve">Homework 01 — Sunny vs. Shady Leaves</w:t>
+      </w:r>
+    </w:p>
+    <w:p>
+      <w:pPr>
+        <w:pStyle w:val="Subtitle"/>
+      </w:pPr>
+      <w:r>
+        <w:t xml:space="preserve">First steps in R: loading data, descriptive statistics, and a first plot</w:t>
       </w:r>
     </w:p>
     <w:p>
@@ -15,16 +23,86 @@
         <w:pStyle w:val="Author"/>
       </w:pPr>
       <w:r>
-        <w:t xml:space="preserve">Bill Perry</w:t>
-      </w:r>
-    </w:p>
-    <w:bookmarkStart w:id="16" w:name="assignment-overview"/>
+        <w:t xml:space="preserve">Name: _________________________________ | Date: _____________</w:t>
+      </w:r>
+    </w:p>
+    <w:p>
+      <w:pPr>
+        <w:pStyle w:val="Date"/>
+      </w:pPr>
+      <w:r>
+        <w:t xml:space="preserve">2026-06-30</w:t>
+      </w:r>
+    </w:p>
+    <w:p>
+      <w:pPr>
+        <w:pStyle w:val="CaptionedFigure"/>
+      </w:pPr>
+      <w:r>
+        <w:drawing>
+          <wp:inline>
+            <wp:extent cx="2971800" cy="5283200"/>
+            <wp:effectExtent b="0" l="0" r="0" t="0"/>
+            <wp:docPr descr="Leaves on the shady side of a tree tend to be larger — a classic example of phenotypic plasticity. Plants adjust leaf size and shape depending on available light. Your class collected leaves from both the sunny and shady sides of trees to test this prediction. (Photo: public domain)" title="" id="10" name="Picture"/>
+            <a:graphic>
+              <a:graphicData uri="http://schemas.openxmlformats.org/drawingml/2006/picture">
+                <pic:pic>
+                  <pic:nvPicPr>
+                    <pic:cNvPr descr="images/tree_sun_shade.jpg" id="11" name="Picture"/>
+                    <pic:cNvPicPr>
+                      <a:picLocks noChangeArrowheads="1" noChangeAspect="1"/>
+                    </pic:cNvPicPr>
+                  </pic:nvPicPr>
+                  <pic:blipFill>
+                    <a:blip r:embed="rId9"/>
+                    <a:stretch>
+                      <a:fillRect/>
+                    </a:stretch>
+                  </pic:blipFill>
+                  <pic:spPr bwMode="auto">
+                    <a:xfrm>
+                      <a:off x="0" y="0"/>
+                      <a:ext cx="2971800" cy="5283200"/>
+                    </a:xfrm>
+                    <a:prstGeom prst="rect">
+                      <a:avLst/>
+                    </a:prstGeom>
+                    <a:noFill/>
+                    <a:ln w="9525">
+                      <a:noFill/>
+                      <a:headEnd/>
+                      <a:tailEnd/>
+                    </a:ln>
+                  </pic:spPr>
+                </pic:pic>
+              </a:graphicData>
+            </a:graphic>
+          </wp:inline>
+        </w:drawing>
+      </w:r>
+    </w:p>
+    <w:p>
+      <w:pPr>
+        <w:pStyle w:val="ImageCaption"/>
+      </w:pPr>
+      <w:r>
+        <w:t xml:space="preserve">Leaves on the shady side of a tree tend to be larger — a classic example of phenotypic plasticity. Plants adjust leaf size and shape depending on available light. Your class collected leaves from both the sunny and shady sides of trees to test this prediction. (Photo: public domain)</w:t>
+      </w:r>
+    </w:p>
+    <w:p>
+      <w:r>
+        <w:pict>
+          <v:rect style="width:0;height:1.5pt" o:hralign="center" o:hrstd="t" o:hr="t"/>
+        </w:pict>
+      </w:r>
+    </w:p>
+    <w:bookmarkStart w:id="12" w:name="overview"/>
     <w:p>
       <w:pPr>
         <w:pStyle w:val="Heading1"/>
       </w:pPr>
       <w:r>
-        <w:t xml:space="preserve">Assignment Overview</w:t>
+        <w:t xml:space="preserve">Overview</w:t>
       </w:r>
     </w:p>
     <w:p>
@@ -32,24 +110,28 @@
         <w:pStyle w:val="FirstParagraph"/>
       </w:pPr>
       <w:r>
-        <w:t xml:space="preserve">This homework assignment focuses on</w:t>
-      </w:r>
-    </w:p>
-    <w:bookmarkStart w:id="9" w:name="learning-objectives"/>
-    <w:p>
-      <w:pPr>
-        <w:pStyle w:val="Heading2"/>
-      </w:pPr>
-      <w:r>
-        <w:t xml:space="preserve">Learning Objectives</w:t>
-      </w:r>
-    </w:p>
-    <w:p>
-      <w:pPr>
-        <w:pStyle w:val="FirstParagraph"/>
-      </w:pPr>
-      <w:r>
-        <w:t xml:space="preserve">By completing this assignment, you will be able to:</w:t>
+        <w:t xml:space="preserve">In Lectures 01–02 and Worksheets 01–02 your class designed an experiment, collected leaf measurements, organized the data in a spreadsheet, and wrote your first R code. This homework asks you to take the next step:</w:t>
+      </w:r>
+      <w:r>
+        <w:t xml:space="preserve"> </w:t>
+      </w:r>
+      <w:r>
+        <w:rPr>
+          <w:b/>
+          <w:bCs/>
+        </w:rPr>
+        <w:t xml:space="preserve">load your class dataset into R, compute descriptive statistics, and make two publication-quality figures</w:t>
+      </w:r>
+      <w:r>
+        <w:t xml:space="preserve">.</w:t>
+      </w:r>
+    </w:p>
+    <w:p>
+      <w:pPr>
+        <w:pStyle w:val="BodyText"/>
+      </w:pPr>
+      <w:r>
+        <w:t xml:space="preserve">You will practice the skills from Lectures 01–02:</w:t>
       </w:r>
     </w:p>
     <w:p>
@@ -61,11 +143,7 @@
         </w:numPr>
       </w:pPr>
       <w:r>
-        <w:rPr>
-          <w:b/>
-          <w:bCs/>
-        </w:rPr>
-        <w:t xml:space="preserve">asdfasdf</w:t>
+        <w:t xml:space="preserve">Setting up an R project with the correct folder structure</w:t>
       </w:r>
     </w:p>
     <w:p>
@@ -77,68 +155,1435 @@
         </w:numPr>
       </w:pPr>
       <w:r>
-        <w:rPr>
-          <w:b/>
-          <w:bCs/>
-        </w:rPr>
-        <w:t xml:space="preserve">adsfafdsa</w:t>
-      </w:r>
-    </w:p>
-    <w:bookmarkEnd w:id="9"/>
-    <w:bookmarkStart w:id="10" w:name="data-description"/>
-    <w:p>
-      <w:pPr>
-        <w:pStyle w:val="Heading2"/>
-      </w:pPr>
-      <w:r>
-        <w:t xml:space="preserve">Data Description</w:t>
-      </w:r>
-    </w:p>
-    <w:bookmarkEnd w:id="10"/>
-    <w:bookmarkStart w:id="15" w:name="goals-to-accomplish"/>
-    <w:p>
-      <w:pPr>
-        <w:pStyle w:val="Heading2"/>
-      </w:pPr>
-      <w:r>
-        <w:t xml:space="preserve">Goals to accomplish</w:t>
-      </w:r>
-    </w:p>
-    <w:p>
-      <w:pPr>
+        <w:t xml:space="preserve">Loading data with</w:t>
+      </w:r>
+      <w:r>
+        <w:t xml:space="preserve"> </w:t>
+      </w:r>
+      <w:r>
+        <w:rPr>
+          <w:rStyle w:val="VerbatimChar"/>
+        </w:rPr>
+        <w:t xml:space="preserve">read_csv()</w:t>
+      </w:r>
+      <w:r>
+        <w:t xml:space="preserve"> </w:t>
+      </w:r>
+      <w:r>
+        <w:t xml:space="preserve">or</w:t>
+      </w:r>
+      <w:r>
+        <w:t xml:space="preserve"> </w:t>
+      </w:r>
+      <w:r>
+        <w:rPr>
+          <w:rStyle w:val="VerbatimChar"/>
+        </w:rPr>
+        <w:t xml:space="preserve">read_excel()</w:t>
+      </w:r>
+    </w:p>
+    <w:p>
+      <w:pPr>
+        <w:pStyle w:val="Compact"/>
         <w:numPr>
           <w:ilvl w:val="0"/>
-          <w:numId w:val="1002"/>
+          <w:numId w:val="1001"/>
         </w:numPr>
       </w:pPr>
       <w:r>
-        <w:t xml:space="preserve">324543</w:t>
-      </w:r>
-    </w:p>
-    <w:p>
-      <w:pPr>
+        <w:t xml:space="preserve">Inspecting a data frame with</w:t>
+      </w:r>
+      <w:r>
+        <w:t xml:space="preserve"> </w:t>
+      </w:r>
+      <w:r>
+        <w:rPr>
+          <w:rStyle w:val="VerbatimChar"/>
+        </w:rPr>
+        <w:t xml:space="preserve">glimpse()</w:t>
+      </w:r>
+      <w:r>
+        <w:t xml:space="preserve">,</w:t>
+      </w:r>
+      <w:r>
+        <w:t xml:space="preserve"> </w:t>
+      </w:r>
+      <w:r>
+        <w:rPr>
+          <w:rStyle w:val="VerbatimChar"/>
+        </w:rPr>
+        <w:t xml:space="preserve">head()</w:t>
+      </w:r>
+      <w:r>
+        <w:t xml:space="preserve">, and</w:t>
+      </w:r>
+      <w:r>
+        <w:t xml:space="preserve"> </w:t>
+      </w:r>
+      <w:r>
+        <w:rPr>
+          <w:rStyle w:val="VerbatimChar"/>
+        </w:rPr>
+        <w:t xml:space="preserve">dim()</w:t>
+      </w:r>
+    </w:p>
+    <w:p>
+      <w:pPr>
+        <w:pStyle w:val="Compact"/>
         <w:numPr>
           <w:ilvl w:val="0"/>
-          <w:numId w:val="1002"/>
+          <w:numId w:val="1001"/>
         </w:numPr>
       </w:pPr>
       <w:r>
-        <w:t xml:space="preserve">45345</w:t>
-      </w:r>
-    </w:p>
-    <w:p>
-      <w:pPr>
-        <w:pStyle w:val="Heading2"/>
+        <w:t xml:space="preserve">Using the pipe</w:t>
+      </w:r>
+      <w:r>
+        <w:t xml:space="preserve"> </w:t>
+      </w:r>
+      <w:r>
+        <w:rPr>
+          <w:rStyle w:val="VerbatimChar"/>
+        </w:rPr>
+        <w:t xml:space="preserve">%&gt;%</w:t>
+      </w:r>
+      <w:r>
+        <w:t xml:space="preserve"> </w:t>
+      </w:r>
+      <w:r>
+        <w:t xml:space="preserve">to chain steps</w:t>
+      </w:r>
+    </w:p>
+    <w:p>
+      <w:pPr>
+        <w:pStyle w:val="Compact"/>
         <w:numPr>
           <w:ilvl w:val="0"/>
-          <w:numId w:val="1002"/>
+          <w:numId w:val="1001"/>
         </w:numPr>
       </w:pPr>
-      <w:bookmarkStart w:id="11" w:name="section"/>
-      <w:r>
-        <w:t xml:space="preserve">4534</w:t>
-      </w:r>
-      <w:bookmarkEnd w:id="11"/>
+      <w:r>
+        <w:t xml:space="preserve">Calculating descriptive statistics with</w:t>
+      </w:r>
+      <w:r>
+        <w:t xml:space="preserve"> </w:t>
+      </w:r>
+      <w:r>
+        <w:rPr>
+          <w:rStyle w:val="VerbatimChar"/>
+        </w:rPr>
+        <w:t xml:space="preserve">summarize()</w:t>
+      </w:r>
+      <w:r>
+        <w:t xml:space="preserve"> </w:t>
+      </w:r>
+      <w:r>
+        <w:t xml:space="preserve">— and understanding</w:t>
+      </w:r>
+      <w:r>
+        <w:t xml:space="preserve"> </w:t>
+      </w:r>
+      <w:r>
+        <w:rPr>
+          <w:i/>
+          <w:iCs/>
+        </w:rPr>
+        <w:t xml:space="preserve">why</w:t>
+      </w:r>
+      <w:r>
+        <w:t xml:space="preserve"> </w:t>
+      </w:r>
+      <w:r>
+        <w:rPr>
+          <w:rStyle w:val="VerbatimChar"/>
+        </w:rPr>
+        <w:t xml:space="preserve">sum(!is.na())</w:t>
+      </w:r>
+      <w:r>
+        <w:t xml:space="preserve"> </w:t>
+      </w:r>
+      <w:r>
+        <w:t xml:space="preserve">is safer than</w:t>
+      </w:r>
+      <w:r>
+        <w:t xml:space="preserve"> </w:t>
+      </w:r>
+      <w:r>
+        <w:rPr>
+          <w:rStyle w:val="VerbatimChar"/>
+        </w:rPr>
+        <w:t xml:space="preserve">length()</w:t>
+      </w:r>
+    </w:p>
+    <w:p>
+      <w:pPr>
+        <w:pStyle w:val="Compact"/>
+        <w:numPr>
+          <w:ilvl w:val="0"/>
+          <w:numId w:val="1001"/>
+        </w:numPr>
+      </w:pPr>
+      <w:r>
+        <w:t xml:space="preserve">Making a boxplot with jittered points using</w:t>
+      </w:r>
+      <w:r>
+        <w:t xml:space="preserve"> </w:t>
+      </w:r>
+      <w:r>
+        <w:rPr>
+          <w:rStyle w:val="VerbatimChar"/>
+        </w:rPr>
+        <w:t xml:space="preserve">ggplot2</w:t>
+      </w:r>
+    </w:p>
+    <w:p>
+      <w:pPr>
+        <w:pStyle w:val="Compact"/>
+        <w:numPr>
+          <w:ilvl w:val="0"/>
+          <w:numId w:val="1001"/>
+        </w:numPr>
+      </w:pPr>
+      <w:r>
+        <w:t xml:space="preserve">Saving plots as PNG at</w:t>
+      </w:r>
+      <w:r>
+        <w:t xml:space="preserve"> </w:t>
+      </w:r>
+      <w:r>
+        <w:rPr>
+          <w:rStyle w:val="VerbatimChar"/>
+        </w:rPr>
+        <w:t xml:space="preserve">dpi = 300</w:t>
+      </w:r>
+    </w:p>
+    <w:p>
+      <w:pPr>
+        <w:pStyle w:val="FirstParagraph"/>
+      </w:pPr>
+      <w:r>
+        <w:rPr>
+          <w:b/>
+          <w:bCs/>
+        </w:rPr>
+        <w:t xml:space="preserve">Science context — Our hypotheses:</w:t>
+      </w:r>
+    </w:p>
+    <w:p>
+      <w:pPr>
+        <w:pStyle w:val="BlockText"/>
+      </w:pPr>
+      <w:r>
+        <w:rPr>
+          <w:b/>
+          <w:bCs/>
+        </w:rPr>
+        <w:t xml:space="preserve">Null Hypothesis (H₀):</w:t>
+      </w:r>
+      <w:r>
+        <w:t xml:space="preserve"> </w:t>
+      </w:r>
+      <w:r>
+        <w:t xml:space="preserve">There is no difference in leaf size or shape between the sunny and shady sides of a tree.</w:t>
+      </w:r>
+    </w:p>
+    <w:p>
+      <w:pPr>
+        <w:pStyle w:val="BlockText"/>
+      </w:pPr>
+      <w:r>
+        <w:rPr>
+          <w:b/>
+          <w:bCs/>
+        </w:rPr>
+        <w:t xml:space="preserve">Alternate Hypothesis (Hₐ):</w:t>
+      </w:r>
+      <w:r>
+        <w:t xml:space="preserve"> </w:t>
+      </w:r>
+      <w:r>
+        <w:t xml:space="preserve">Leaf size differs between the sunny and shady sides of a tree (shady leaves are predicted to be larger).</w:t>
+      </w:r>
+    </w:p>
+    <w:p>
+      <w:pPr>
+        <w:pStyle w:val="BlockText"/>
+      </w:pPr>
+      <w:r>
+        <w:rPr>
+          <w:b/>
+          <w:bCs/>
+        </w:rPr>
+        <w:t xml:space="preserve">Submit to Canvas:</w:t>
+      </w:r>
+      <w:r>
+        <w:t xml:space="preserve"> </w:t>
+      </w:r>
+      <w:r>
+        <w:t xml:space="preserve">(1) your completed</w:t>
+      </w:r>
+      <w:r>
+        <w:t xml:space="preserve"> </w:t>
+      </w:r>
+      <w:r>
+        <w:rPr>
+          <w:rStyle w:val="VerbatimChar"/>
+        </w:rPr>
+        <w:t xml:space="preserve">01_leaves.R</w:t>
+      </w:r>
+      <w:r>
+        <w:t xml:space="preserve"> </w:t>
+      </w:r>
+      <w:r>
+        <w:t xml:space="preserve">script and (2) two saved PNG figures. Fill in all answer boxes</w:t>
+      </w:r>
+      <w:r>
+        <w:t xml:space="preserve"> </w:t>
+      </w:r>
+      <w:r>
+        <w:rPr>
+          <w:b/>
+          <w:bCs/>
+        </w:rPr>
+        <w:t xml:space="preserve">in the script as</w:t>
+      </w:r>
+      <w:r>
+        <w:rPr>
+          <w:b/>
+          <w:bCs/>
+        </w:rPr>
+        <w:t xml:space="preserve"> </w:t>
+      </w:r>
+      <w:r>
+        <w:rPr>
+          <w:rStyle w:val="VerbatimChar"/>
+          <w:b/>
+          <w:bCs/>
+        </w:rPr>
+        <w:t xml:space="preserve">#</w:t>
+      </w:r>
+      <w:r>
+        <w:rPr>
+          <w:b/>
+          <w:bCs/>
+        </w:rPr>
+        <w:t xml:space="preserve"> </w:t>
+      </w:r>
+      <w:r>
+        <w:rPr>
+          <w:b/>
+          <w:bCs/>
+        </w:rPr>
+        <w:t xml:space="preserve">comments</w:t>
+      </w:r>
+      <w:r>
+        <w:t xml:space="preserve"> </w:t>
+      </w:r>
+      <w:r>
+        <w:t xml:space="preserve">below the relevant code. The question numbers here match the</w:t>
+      </w:r>
+      <w:r>
+        <w:t xml:space="preserve"> </w:t>
+      </w:r>
+      <w:r>
+        <w:rPr>
+          <w:rStyle w:val="VerbatimChar"/>
+        </w:rPr>
+        <w:t xml:space="preserve"># Q__</w:t>
+      </w:r>
+      <w:r>
+        <w:t xml:space="preserve"> </w:t>
+      </w:r>
+      <w:r>
+        <w:t xml:space="preserve">markers in the skeleton script.</w:t>
+      </w:r>
+    </w:p>
+    <w:p>
+      <w:r>
+        <w:pict>
+          <v:rect style="width:0;height:1.5pt" o:hralign="center" o:hrstd="t" o:hr="t"/>
+        </w:pict>
+      </w:r>
+    </w:p>
+    <w:bookmarkEnd w:id="12"/>
+    <w:bookmarkStart w:id="15" w:name="the-data"/>
+    <w:p>
+      <w:pPr>
+        <w:pStyle w:val="Heading1"/>
+      </w:pPr>
+      <w:r>
+        <w:t xml:space="preserve">The Data</w:t>
+      </w:r>
+    </w:p>
+    <w:p>
+      <w:pPr>
+        <w:pStyle w:val="FirstParagraph"/>
+      </w:pPr>
+      <w:r>
+        <w:t xml:space="preserve">Your class measured leaves from the sunny and shady sides of trees. The data file</w:t>
+      </w:r>
+      <w:r>
+        <w:t xml:space="preserve"> </w:t>
+      </w:r>
+      <w:r>
+        <w:rPr>
+          <w:rStyle w:val="VerbatimChar"/>
+        </w:rPr>
+        <w:t xml:space="preserve">tree_leaves.csv</w:t>
+      </w:r>
+      <w:r>
+        <w:t xml:space="preserve"> </w:t>
+      </w:r>
+      <w:r>
+        <w:t xml:space="preserve">(posted on Canvas) has the following columns:</w:t>
+      </w:r>
+    </w:p>
+    <w:tbl>
+      <w:tblPr>
+        <w:tblStyle w:val="Table"/>
+        <w:tblW w:type="pct" w:w="5000"/>
+        <w:tblLayout w:type="fixed"/>
+        <w:tblLook w:firstRow="1" w:lastRow="0" w:firstColumn="0" w:lastColumn="0" w:noHBand="0" w:noVBand="0" w:val="0020"/>
+      </w:tblPr>
+      <w:tblGrid>
+        <w:gridCol w:w="1492"/>
+        <w:gridCol w:w="688"/>
+        <w:gridCol w:w="5739"/>
+      </w:tblGrid>
+      <w:tr>
+        <w:trPr>
+          <w:tblHeader w:val="on"/>
+        </w:trPr>
+        <w:tc>
+          <w:tcPr/>
+          <w:p>
+            <w:pPr>
+              <w:pStyle w:val="Compact"/>
+            </w:pPr>
+            <w:r>
+              <w:t xml:space="preserve">Column</w:t>
+            </w:r>
+          </w:p>
+        </w:tc>
+        <w:tc>
+          <w:tcPr/>
+          <w:p>
+            <w:pPr>
+              <w:pStyle w:val="Compact"/>
+            </w:pPr>
+            <w:r>
+              <w:t xml:space="preserve">Type</w:t>
+            </w:r>
+          </w:p>
+        </w:tc>
+        <w:tc>
+          <w:tcPr/>
+          <w:p>
+            <w:pPr>
+              <w:pStyle w:val="Compact"/>
+            </w:pPr>
+            <w:r>
+              <w:t xml:space="preserve">What it holds</w:t>
+            </w:r>
+          </w:p>
+        </w:tc>
+      </w:tr>
+      <w:tr>
+        <w:tc>
+          <w:tcPr/>
+          <w:p>
+            <w:pPr>
+              <w:pStyle w:val="Compact"/>
+            </w:pPr>
+            <w:r>
+              <w:rPr>
+                <w:rStyle w:val="VerbatimChar"/>
+              </w:rPr>
+              <w:t xml:space="preserve">tree_id</w:t>
+            </w:r>
+          </w:p>
+        </w:tc>
+        <w:tc>
+          <w:tcPr/>
+          <w:p>
+            <w:pPr>
+              <w:pStyle w:val="Compact"/>
+            </w:pPr>
+            <w:r>
+              <w:t xml:space="preserve">chr</w:t>
+            </w:r>
+          </w:p>
+        </w:tc>
+        <w:tc>
+          <w:tcPr/>
+          <w:p>
+            <w:pPr>
+              <w:pStyle w:val="Compact"/>
+            </w:pPr>
+            <w:r>
+              <w:t xml:space="preserve">Which tree the leaf came from (T1–T5)</w:t>
+            </w:r>
+          </w:p>
+        </w:tc>
+      </w:tr>
+      <w:tr>
+        <w:tc>
+          <w:tcPr/>
+          <w:p>
+            <w:pPr>
+              <w:pStyle w:val="Compact"/>
+            </w:pPr>
+            <w:r>
+              <w:rPr>
+                <w:rStyle w:val="VerbatimChar"/>
+              </w:rPr>
+              <w:t xml:space="preserve">side</w:t>
+            </w:r>
+          </w:p>
+        </w:tc>
+        <w:tc>
+          <w:tcPr/>
+          <w:p>
+            <w:pPr>
+              <w:pStyle w:val="Compact"/>
+            </w:pPr>
+            <w:r>
+              <w:t xml:space="preserve">chr</w:t>
+            </w:r>
+          </w:p>
+        </w:tc>
+        <w:tc>
+          <w:tcPr/>
+          <w:p>
+            <w:pPr>
+              <w:pStyle w:val="Compact"/>
+            </w:pPr>
+            <w:r>
+              <w:rPr>
+                <w:rStyle w:val="VerbatimChar"/>
+              </w:rPr>
+              <w:t xml:space="preserve">"sunny"</w:t>
+            </w:r>
+            <w:r>
+              <w:t xml:space="preserve"> </w:t>
+            </w:r>
+            <w:r>
+              <w:t xml:space="preserve">or</w:t>
+            </w:r>
+            <w:r>
+              <w:t xml:space="preserve"> </w:t>
+            </w:r>
+            <w:r>
+              <w:rPr>
+                <w:rStyle w:val="VerbatimChar"/>
+              </w:rPr>
+              <w:t xml:space="preserve">"shady"</w:t>
+            </w:r>
+          </w:p>
+        </w:tc>
+      </w:tr>
+      <w:tr>
+        <w:tc>
+          <w:tcPr/>
+          <w:p>
+            <w:pPr>
+              <w:pStyle w:val="Compact"/>
+            </w:pPr>
+            <w:r>
+              <w:rPr>
+                <w:rStyle w:val="VerbatimChar"/>
+              </w:rPr>
+              <w:t xml:space="preserve">leaf_num</w:t>
+            </w:r>
+          </w:p>
+        </w:tc>
+        <w:tc>
+          <w:tcPr/>
+          <w:p>
+            <w:pPr>
+              <w:pStyle w:val="Compact"/>
+            </w:pPr>
+            <w:r>
+              <w:t xml:space="preserve">num</w:t>
+            </w:r>
+          </w:p>
+        </w:tc>
+        <w:tc>
+          <w:tcPr/>
+          <w:p>
+            <w:pPr>
+              <w:pStyle w:val="Compact"/>
+            </w:pPr>
+            <w:r>
+              <w:t xml:space="preserve">Leaf number within that tree and side</w:t>
+            </w:r>
+          </w:p>
+        </w:tc>
+      </w:tr>
+      <w:tr>
+        <w:tc>
+          <w:tcPr/>
+          <w:p>
+            <w:pPr>
+              <w:pStyle w:val="Compact"/>
+            </w:pPr>
+            <w:r>
+              <w:rPr>
+                <w:rStyle w:val="VerbatimChar"/>
+              </w:rPr>
+              <w:t xml:space="preserve">weight_g</w:t>
+            </w:r>
+          </w:p>
+        </w:tc>
+        <w:tc>
+          <w:tcPr/>
+          <w:p>
+            <w:pPr>
+              <w:pStyle w:val="Compact"/>
+            </w:pPr>
+            <w:r>
+              <w:t xml:space="preserve">num</w:t>
+            </w:r>
+          </w:p>
+        </w:tc>
+        <w:tc>
+          <w:tcPr/>
+          <w:p>
+            <w:pPr>
+              <w:pStyle w:val="Compact"/>
+            </w:pPr>
+            <w:r>
+              <w:t xml:space="preserve">Leaf weight</w:t>
+            </w:r>
+            <w:r>
+              <w:t xml:space="preserve"> </w:t>
+            </w:r>
+            <w:r>
+              <w:rPr>
+                <w:b/>
+                <w:bCs/>
+              </w:rPr>
+              <w:t xml:space="preserve">(g)</w:t>
+            </w:r>
+          </w:p>
+        </w:tc>
+      </w:tr>
+      <w:tr>
+        <w:tc>
+          <w:tcPr/>
+          <w:p>
+            <w:pPr>
+              <w:pStyle w:val="Compact"/>
+            </w:pPr>
+            <w:r>
+              <w:rPr>
+                <w:rStyle w:val="VerbatimChar"/>
+              </w:rPr>
+              <w:t xml:space="preserve">width_cm</w:t>
+            </w:r>
+          </w:p>
+        </w:tc>
+        <w:tc>
+          <w:tcPr/>
+          <w:p>
+            <w:pPr>
+              <w:pStyle w:val="Compact"/>
+            </w:pPr>
+            <w:r>
+              <w:t xml:space="preserve">num</w:t>
+            </w:r>
+          </w:p>
+        </w:tc>
+        <w:tc>
+          <w:tcPr/>
+          <w:p>
+            <w:pPr>
+              <w:pStyle w:val="Compact"/>
+            </w:pPr>
+            <w:r>
+              <w:t xml:space="preserve">Leaf width at the widest point</w:t>
+            </w:r>
+            <w:r>
+              <w:t xml:space="preserve"> </w:t>
+            </w:r>
+            <w:r>
+              <w:rPr>
+                <w:b/>
+                <w:bCs/>
+              </w:rPr>
+              <w:t xml:space="preserve">(cm)</w:t>
+            </w:r>
+          </w:p>
+        </w:tc>
+      </w:tr>
+      <w:tr>
+        <w:tc>
+          <w:tcPr/>
+          <w:p>
+            <w:pPr>
+              <w:pStyle w:val="Compact"/>
+            </w:pPr>
+            <w:r>
+              <w:rPr>
+                <w:rStyle w:val="VerbatimChar"/>
+              </w:rPr>
+              <w:t xml:space="preserve">height_cm</w:t>
+            </w:r>
+          </w:p>
+        </w:tc>
+        <w:tc>
+          <w:tcPr/>
+          <w:p>
+            <w:pPr>
+              <w:pStyle w:val="Compact"/>
+            </w:pPr>
+            <w:r>
+              <w:t xml:space="preserve">num</w:t>
+            </w:r>
+          </w:p>
+        </w:tc>
+        <w:tc>
+          <w:tcPr/>
+          <w:p>
+            <w:pPr>
+              <w:pStyle w:val="Compact"/>
+            </w:pPr>
+            <w:r>
+              <w:t xml:space="preserve">Leaf length from base to tip</w:t>
+            </w:r>
+            <w:r>
+              <w:t xml:space="preserve"> </w:t>
+            </w:r>
+            <w:r>
+              <w:rPr>
+                <w:b/>
+                <w:bCs/>
+              </w:rPr>
+              <w:t xml:space="preserve">(cm)</w:t>
+            </w:r>
+          </w:p>
+        </w:tc>
+      </w:tr>
+      <w:tr>
+        <w:tc>
+          <w:tcPr/>
+          <w:p>
+            <w:pPr>
+              <w:pStyle w:val="Compact"/>
+            </w:pPr>
+            <w:r>
+              <w:rPr>
+                <w:rStyle w:val="VerbatimChar"/>
+              </w:rPr>
+              <w:t xml:space="preserve">area_cm2</w:t>
+            </w:r>
+          </w:p>
+        </w:tc>
+        <w:tc>
+          <w:tcPr/>
+          <w:p>
+            <w:pPr>
+              <w:pStyle w:val="Compact"/>
+            </w:pPr>
+            <w:r>
+              <w:t xml:space="preserve">num</w:t>
+            </w:r>
+          </w:p>
+        </w:tc>
+        <w:tc>
+          <w:tcPr/>
+          <w:p>
+            <w:pPr>
+              <w:pStyle w:val="Compact"/>
+            </w:pPr>
+            <w:r>
+              <w:t xml:space="preserve">Estimated leaf area</w:t>
+            </w:r>
+            <w:r>
+              <w:t xml:space="preserve"> </w:t>
+            </w:r>
+            <w:r>
+              <w:rPr>
+                <w:b/>
+                <w:bCs/>
+              </w:rPr>
+              <w:t xml:space="preserve">(cm²)</w:t>
+            </w:r>
+            <w:r>
+              <w:t xml:space="preserve"> </w:t>
+            </w:r>
+            <w:r>
+              <w:t xml:space="preserve">— may contain</w:t>
+            </w:r>
+            <w:r>
+              <w:t xml:space="preserve"> </w:t>
+            </w:r>
+            <w:r>
+              <w:rPr>
+                <w:rStyle w:val="VerbatimChar"/>
+              </w:rPr>
+              <w:t xml:space="preserve">NA</w:t>
+            </w:r>
+          </w:p>
+        </w:tc>
+      </w:tr>
+    </w:tbl>
+    <w:p>
+      <w:pPr>
+        <w:pStyle w:val="BodyText"/>
+      </w:pPr>
+      <w:r>
+        <w:rPr>
+          <w:b/>
+          <w:bCs/>
+        </w:rPr>
+        <w:t xml:space="preserve">Reference:</w:t>
+      </w:r>
+      <w:r>
+        <w:t xml:space="preserve"> </w:t>
+      </w:r>
+      <w:r>
+        <w:t xml:space="preserve">Lectures 01–02 and Worksheets 01–02;</w:t>
+      </w:r>
+      <w:r>
+        <w:t xml:space="preserve"> </w:t>
+      </w:r>
+      <w:hyperlink r:id="rId13">
+        <w:r>
+          <w:rPr>
+            <w:rStyle w:val="Hyperlink"/>
+          </w:rPr>
+          <w:t xml:space="preserve">R for Data Science Ch. 1–3</w:t>
+        </w:r>
+      </w:hyperlink>
+      <w:r>
+        <w:t xml:space="preserve">;</w:t>
+      </w:r>
+      <w:r>
+        <w:t xml:space="preserve"> </w:t>
+      </w:r>
+      <w:hyperlink r:id="rId14">
+        <w:r>
+          <w:rPr>
+            <w:rStyle w:val="Hyperlink"/>
+          </w:rPr>
+          <w:t xml:space="preserve">Data Carpentry — R for Ecology</w:t>
+        </w:r>
+      </w:hyperlink>
+    </w:p>
+    <w:p>
+      <w:r>
+        <w:pict>
+          <v:rect style="width:0;height:1.5pt" o:hralign="center" o:hrstd="t" o:hr="t"/>
+        </w:pict>
+      </w:r>
+    </w:p>
+    <w:bookmarkEnd w:id="15"/>
+    <w:bookmarkStart w:id="18" w:name="X29000e87cf4c89c9ca74d6d5c2b893ff9a005a2"/>
+    <w:p>
+      <w:pPr>
+        <w:pStyle w:val="Heading1"/>
+      </w:pPr>
+      <w:r>
+        <w:t xml:space="preserve">Part 1 · Set up and load (→ Lecture 02, Worksheet 02)</w:t>
+      </w:r>
+    </w:p>
+    <w:bookmarkStart w:id="16" w:name="get-your-project-organized"/>
+    <w:p>
+      <w:pPr>
+        <w:pStyle w:val="Heading3"/>
+      </w:pPr>
+      <w:r>
+        <w:t xml:space="preserve">Get your project organized</w:t>
+      </w:r>
+    </w:p>
+    <w:p>
+      <w:pPr>
+        <w:pStyle w:val="FirstParagraph"/>
+      </w:pPr>
+      <w:r>
+        <w:t xml:space="preserve">Before writing any code, confirm that your project folder looks like this:</w:t>
+      </w:r>
+    </w:p>
+    <w:p>
+      <w:pPr>
+        <w:pStyle w:val="SourceCode"/>
+      </w:pPr>
+      <w:r>
+        <w:rPr>
+          <w:rStyle w:val="VerbatimChar"/>
+        </w:rPr>
+        <w:t xml:space="preserve">tree_project/</w:t>
+      </w:r>
+      <w:r>
+        <w:br/>
+      </w:r>
+      <w:r>
+        <w:rPr>
+          <w:rStyle w:val="VerbatimChar"/>
+        </w:rPr>
+        <w:t xml:space="preserve">├── data/</w:t>
+      </w:r>
+      <w:r>
+        <w:br/>
+      </w:r>
+      <w:r>
+        <w:rPr>
+          <w:rStyle w:val="VerbatimChar"/>
+        </w:rPr>
+        <w:t xml:space="preserve">│   └── tree_leaves.csv      ← copy from Canvas; never touch this file</w:t>
+      </w:r>
+      <w:r>
+        <w:br/>
+      </w:r>
+      <w:r>
+        <w:rPr>
+          <w:rStyle w:val="VerbatimChar"/>
+        </w:rPr>
+        <w:t xml:space="preserve">├── scripts/</w:t>
+      </w:r>
+      <w:r>
+        <w:br/>
+      </w:r>
+      <w:r>
+        <w:rPr>
+          <w:rStyle w:val="VerbatimChar"/>
+        </w:rPr>
+        <w:t xml:space="preserve">│   └── 01_leaves.R          ← your script for this homework</w:t>
+      </w:r>
+      <w:r>
+        <w:br/>
+      </w:r>
+      <w:r>
+        <w:rPr>
+          <w:rStyle w:val="VerbatimChar"/>
+        </w:rPr>
+        <w:t xml:space="preserve">└── figures/                 ← plots you save will go here</w:t>
+      </w:r>
+    </w:p>
+    <w:p>
+      <w:pPr>
+        <w:pStyle w:val="FirstParagraph"/>
+      </w:pPr>
+      <w:r>
+        <w:t xml:space="preserve">Open</w:t>
+      </w:r>
+      <w:r>
+        <w:t xml:space="preserve"> </w:t>
+      </w:r>
+      <w:r>
+        <w:rPr>
+          <w:rStyle w:val="VerbatimChar"/>
+        </w:rPr>
+        <w:t xml:space="preserve">tree_project</w:t>
+      </w:r>
+      <w:r>
+        <w:t xml:space="preserve"> </w:t>
+      </w:r>
+      <w:r>
+        <w:t xml:space="preserve">as your workspace in Positron (</w:t>
+      </w:r>
+      <w:r>
+        <w:rPr>
+          <w:b/>
+          <w:bCs/>
+        </w:rPr>
+        <w:t xml:space="preserve">File → Open Folder</w:t>
+      </w:r>
+      <w:r>
+        <w:t xml:space="preserve">).</w:t>
+      </w:r>
+    </w:p>
+    <w:bookmarkEnd w:id="16"/>
+    <w:bookmarkStart w:id="17" w:name="load-the-data"/>
+    <w:p>
+      <w:pPr>
+        <w:pStyle w:val="Heading3"/>
+      </w:pPr>
+      <w:r>
+        <w:t xml:space="preserve">Load the data</w:t>
+      </w:r>
+    </w:p>
+    <w:p>
+      <w:pPr>
+        <w:pStyle w:val="FirstParagraph"/>
+      </w:pPr>
+      <w:r>
+        <w:t xml:space="preserve">In your skeleton script, the</w:t>
+      </w:r>
+      <w:r>
+        <w:t xml:space="preserve"> </w:t>
+      </w:r>
+      <w:r>
+        <w:rPr>
+          <w:rStyle w:val="VerbatimChar"/>
+        </w:rPr>
+        <w:t xml:space="preserve">read_csv()</w:t>
+      </w:r>
+      <w:r>
+        <w:t xml:space="preserve"> </w:t>
+      </w:r>
+      <w:r>
+        <w:t xml:space="preserve">call is already written. Run it, then use</w:t>
+      </w:r>
+      <w:r>
+        <w:t xml:space="preserve"> </w:t>
+      </w:r>
+      <w:r>
+        <w:rPr>
+          <w:rStyle w:val="VerbatimChar"/>
+        </w:rPr>
+        <w:t xml:space="preserve">glimpse()</w:t>
+      </w:r>
+      <w:r>
+        <w:t xml:space="preserve"> </w:t>
+      </w:r>
+      <w:r>
+        <w:t xml:space="preserve">and</w:t>
+      </w:r>
+      <w:r>
+        <w:t xml:space="preserve"> </w:t>
+      </w:r>
+      <w:r>
+        <w:rPr>
+          <w:rStyle w:val="VerbatimChar"/>
+        </w:rPr>
+        <w:t xml:space="preserve">dim()</w:t>
+      </w:r>
+      <w:r>
+        <w:t xml:space="preserve"> </w:t>
+      </w:r>
+      <w:r>
+        <w:t xml:space="preserve">to inspect the result.</w:t>
+      </w:r>
+    </w:p>
+    <w:p>
+      <w:pPr>
+        <w:pStyle w:val="BodyText"/>
+      </w:pPr>
+      <w:r>
+        <w:t xml:space="preserve">After loading, answer:</w:t>
+      </w:r>
+    </w:p>
+    <w:p>
+      <w:pPr>
+        <w:pStyle w:val="BlockText"/>
+      </w:pPr>
+      <w:r>
+        <w:rPr>
+          <w:b/>
+          <w:bCs/>
+        </w:rPr>
+        <w:t xml:space="preserve">Q1 — Total rows in the dataset:</w:t>
+      </w:r>
+      <w:r>
+        <w:t xml:space="preserve"> </w:t>
+      </w:r>
+      <w:r>
+        <w:t xml:space="preserve">________</w:t>
+      </w:r>
+    </w:p>
+    <w:p>
+      <w:pPr>
+        <w:pStyle w:val="BlockText"/>
+      </w:pPr>
+      <w:r>
+        <w:rPr>
+          <w:b/>
+          <w:bCs/>
+        </w:rPr>
+        <w:t xml:space="preserve">Q2 — Total columns:</w:t>
+      </w:r>
+      <w:r>
+        <w:t xml:space="preserve"> </w:t>
+      </w:r>
+      <w:r>
+        <w:t xml:space="preserve">________</w:t>
+      </w:r>
+    </w:p>
+    <w:p>
+      <w:pPr>
+        <w:pStyle w:val="BlockText"/>
+      </w:pPr>
+      <w:r>
+        <w:rPr>
+          <w:b/>
+          <w:bCs/>
+        </w:rPr>
+        <w:t xml:space="preserve">Q3 — Data type of the</w:t>
+      </w:r>
+      <w:r>
+        <w:rPr>
+          <w:b/>
+          <w:bCs/>
+        </w:rPr>
+        <w:t xml:space="preserve"> </w:t>
+      </w:r>
+      <w:r>
+        <w:rPr>
+          <w:rStyle w:val="VerbatimChar"/>
+          <w:b/>
+          <w:bCs/>
+        </w:rPr>
+        <w:t xml:space="preserve">side</w:t>
+      </w:r>
+      <w:r>
+        <w:rPr>
+          <w:b/>
+          <w:bCs/>
+        </w:rPr>
+        <w:t xml:space="preserve"> </w:t>
+      </w:r>
+      <w:r>
+        <w:rPr>
+          <w:b/>
+          <w:bCs/>
+        </w:rPr>
+        <w:t xml:space="preserve">column (from</w:t>
+      </w:r>
+      <w:r>
+        <w:rPr>
+          <w:b/>
+          <w:bCs/>
+        </w:rPr>
+        <w:t xml:space="preserve"> </w:t>
+      </w:r>
+      <w:r>
+        <w:rPr>
+          <w:rStyle w:val="VerbatimChar"/>
+          <w:b/>
+          <w:bCs/>
+        </w:rPr>
+        <w:t xml:space="preserve">glimpse()</w:t>
+      </w:r>
+      <w:r>
+        <w:rPr>
+          <w:b/>
+          <w:bCs/>
+        </w:rPr>
+        <w:t xml:space="preserve">):</w:t>
+      </w:r>
+      <w:r>
+        <w:t xml:space="preserve"> </w:t>
+      </w:r>
+      <w:r>
+        <w:t xml:space="preserve">________</w:t>
+      </w:r>
+    </w:p>
+    <w:p>
+      <w:pPr>
+        <w:pStyle w:val="FirstParagraph"/>
+      </w:pPr>
+      <w:r>
+        <w:t xml:space="preserve">Count leaves by side using</w:t>
+      </w:r>
+      <w:r>
+        <w:t xml:space="preserve"> </w:t>
+      </w:r>
+      <w:r>
+        <w:rPr>
+          <w:rStyle w:val="VerbatimChar"/>
+        </w:rPr>
+        <w:t xml:space="preserve">count(leaf_df, side)</w:t>
+      </w:r>
+      <w:r>
+        <w:t xml:space="preserve">:</w:t>
+      </w:r>
+    </w:p>
+    <w:p>
+      <w:pPr>
+        <w:pStyle w:val="BlockText"/>
+      </w:pPr>
+      <w:r>
+        <w:rPr>
+          <w:b/>
+          <w:bCs/>
+        </w:rPr>
+        <w:t xml:space="preserve">Q4 — Number of sunny leaves:</w:t>
+      </w:r>
+      <w:r>
+        <w:t xml:space="preserve"> </w:t>
+      </w:r>
+      <w:r>
+        <w:t xml:space="preserve">________</w:t>
+      </w:r>
+    </w:p>
+    <w:p>
+      <w:pPr>
+        <w:pStyle w:val="BlockText"/>
+      </w:pPr>
+      <w:r>
+        <w:rPr>
+          <w:b/>
+          <w:bCs/>
+        </w:rPr>
+        <w:t xml:space="preserve">Q5 — Number of shady leaves:</w:t>
+      </w:r>
+      <w:r>
+        <w:t xml:space="preserve"> </w:t>
+      </w:r>
+      <w:r>
+        <w:t xml:space="preserve">________</w:t>
+      </w:r>
+    </w:p>
+    <w:p>
+      <w:r>
+        <w:pict>
+          <v:rect style="width:0;height:1.5pt" o:hralign="center" o:hrstd="t" o:hr="t"/>
+        </w:pict>
+      </w:r>
+    </w:p>
+    <w:bookmarkEnd w:id="17"/>
+    <w:bookmarkEnd w:id="18"/>
+    <w:bookmarkStart w:id="23" w:name="X5d57148c4d0df8fc8967054c5b3687e0a07bdad"/>
+    <w:p>
+      <w:pPr>
+        <w:pStyle w:val="Heading1"/>
+      </w:pPr>
+      <w:r>
+        <w:t xml:space="preserve">Part 2 · Why</w:t>
+      </w:r>
+      <w:r>
+        <w:t xml:space="preserve"> </w:t>
+      </w:r>
+      <w:r>
+        <w:rPr>
+          <w:rStyle w:val="VerbatimChar"/>
+        </w:rPr>
+        <w:t xml:space="preserve">sum(!is.na())</w:t>
+      </w:r>
+      <w:r>
+        <w:t xml:space="preserve"> </w:t>
+      </w:r>
+      <w:r>
+        <w:t xml:space="preserve">beats</w:t>
+      </w:r>
+      <w:r>
+        <w:t xml:space="preserve"> </w:t>
+      </w:r>
+      <w:r>
+        <w:rPr>
+          <w:rStyle w:val="VerbatimChar"/>
+        </w:rPr>
+        <w:t xml:space="preserve">length()</w:t>
+      </w:r>
+      <w:r>
+        <w:t xml:space="preserve"> </w:t>
+      </w:r>
+      <w:r>
+        <w:t xml:space="preserve">(→ Lecture 02)</w:t>
+      </w:r>
+    </w:p>
+    <w:p>
+      <w:pPr>
+        <w:pStyle w:val="FirstParagraph"/>
+      </w:pPr>
+      <w:r>
+        <w:t xml:space="preserve">Real data has missing values (</w:t>
+      </w:r>
+      <w:r>
+        <w:rPr>
+          <w:rStyle w:val="VerbatimChar"/>
+        </w:rPr>
+        <w:t xml:space="preserve">NA</w:t>
+      </w:r>
+      <w:r>
+        <w:t xml:space="preserve">). The function</w:t>
+      </w:r>
+      <w:r>
+        <w:t xml:space="preserve"> </w:t>
+      </w:r>
+      <w:r>
+        <w:rPr>
+          <w:rStyle w:val="VerbatimChar"/>
+        </w:rPr>
+        <w:t xml:space="preserve">length()</w:t>
+      </w:r>
+      <w:r>
+        <w:t xml:space="preserve"> </w:t>
+      </w:r>
+      <w:r>
+        <w:t xml:space="preserve">counts</w:t>
+      </w:r>
+      <w:r>
+        <w:t xml:space="preserve"> </w:t>
+      </w:r>
+      <w:r>
+        <w:rPr>
+          <w:b/>
+          <w:bCs/>
+        </w:rPr>
+        <w:t xml:space="preserve">all</w:t>
+      </w:r>
+      <w:r>
+        <w:t xml:space="preserve"> </w:t>
+      </w:r>
+      <w:r>
+        <w:t xml:space="preserve">values — including</w:t>
+      </w:r>
+      <w:r>
+        <w:t xml:space="preserve"> </w:t>
+      </w:r>
+      <w:r>
+        <w:rPr>
+          <w:rStyle w:val="VerbatimChar"/>
+        </w:rPr>
+        <w:t xml:space="preserve">NA</w:t>
+      </w:r>
+      <w:r>
+        <w:t xml:space="preserve">s — so it can give you the wrong sample size. The safer approach is</w:t>
+      </w:r>
+      <w:r>
+        <w:t xml:space="preserve"> </w:t>
+      </w:r>
+      <w:r>
+        <w:rPr>
+          <w:rStyle w:val="VerbatimChar"/>
+        </w:rPr>
+        <w:t xml:space="preserve">sum(!is.na(variable))</w:t>
+      </w:r>
+      <w:r>
+        <w:t xml:space="preserve">, which counts only the values that are actually there.</w:t>
+      </w:r>
+    </w:p>
+    <w:p>
+      <w:pPr>
+        <w:pStyle w:val="BodyText"/>
+      </w:pPr>
+      <w:r>
+        <w:t xml:space="preserve">Run the two lines in the skeleton and answer:</w:t>
+      </w:r>
+    </w:p>
+    <w:p>
+      <w:pPr>
+        <w:pStyle w:val="BlockText"/>
+      </w:pPr>
+      <w:r>
+        <w:rPr>
+          <w:b/>
+          <w:bCs/>
+        </w:rPr>
+        <w:t xml:space="preserve">Q6 — What does</w:t>
+      </w:r>
+      <w:r>
+        <w:rPr>
+          <w:b/>
+          <w:bCs/>
+        </w:rPr>
+        <w:t xml:space="preserve"> </w:t>
+      </w:r>
+      <w:r>
+        <w:rPr>
+          <w:rStyle w:val="VerbatimChar"/>
+          <w:b/>
+          <w:bCs/>
+        </w:rPr>
+        <w:t xml:space="preserve">length(leaf_df$area_cm2)</w:t>
+      </w:r>
+      <w:r>
+        <w:rPr>
+          <w:b/>
+          <w:bCs/>
+        </w:rPr>
+        <w:t xml:space="preserve"> </w:t>
+      </w:r>
+      <w:r>
+        <w:rPr>
+          <w:b/>
+          <w:bCs/>
+        </w:rPr>
+        <w:t xml:space="preserve">return?</w:t>
+      </w:r>
+      <w:r>
+        <w:t xml:space="preserve"> </w:t>
+      </w:r>
+      <w:r>
+        <w:t xml:space="preserve">________</w:t>
+      </w:r>
+    </w:p>
+    <w:p>
+      <w:pPr>
+        <w:pStyle w:val="BlockText"/>
+      </w:pPr>
+      <w:r>
+        <w:rPr>
+          <w:b/>
+          <w:bCs/>
+        </w:rPr>
+        <w:t xml:space="preserve">Q7 — What does</w:t>
+      </w:r>
+      <w:r>
+        <w:rPr>
+          <w:b/>
+          <w:bCs/>
+        </w:rPr>
+        <w:t xml:space="preserve"> </w:t>
+      </w:r>
+      <w:r>
+        <w:rPr>
+          <w:rStyle w:val="VerbatimChar"/>
+          <w:b/>
+          <w:bCs/>
+        </w:rPr>
+        <w:t xml:space="preserve">sum(!is.na(leaf_df$area_cm2))</w:t>
+      </w:r>
+      <w:r>
+        <w:rPr>
+          <w:b/>
+          <w:bCs/>
+        </w:rPr>
+        <w:t xml:space="preserve"> </w:t>
+      </w:r>
+      <w:r>
+        <w:rPr>
+          <w:b/>
+          <w:bCs/>
+        </w:rPr>
+        <w:t xml:space="preserve">return?</w:t>
+      </w:r>
+      <w:r>
+        <w:t xml:space="preserve"> </w:t>
+      </w:r>
+      <w:r>
+        <w:t xml:space="preserve">________</w:t>
+      </w:r>
+    </w:p>
+    <w:p>
+      <w:pPr>
+        <w:pStyle w:val="BlockText"/>
+      </w:pPr>
+      <w:r>
+        <w:rPr>
+          <w:b/>
+          <w:bCs/>
+        </w:rPr>
+        <w:t xml:space="preserve">Q8 — Are those numbers the same?</w:t>
+      </w:r>
+      <w:r>
+        <w:t xml:space="preserve"> </w:t>
+      </w:r>
+      <w:r>
+        <w:t xml:space="preserve">Y / N</w:t>
+      </w:r>
+    </w:p>
+    <w:p>
+      <w:pPr>
+        <w:pStyle w:val="BlockText"/>
+      </w:pPr>
+      <w:r>
+        <w:rPr>
+          <w:b/>
+          <w:bCs/>
+        </w:rPr>
+        <w:t xml:space="preserve">Q9 — If they differ, what does the difference tell you?</w:t>
+      </w:r>
+    </w:p>
+    <w:p>
+      <w:r>
+        <w:pict>
+          <v:rect style="width:0;height:1.5pt" o:hralign="center" o:hrstd="t" o:hr="t"/>
+        </w:pict>
+      </w:r>
     </w:p>
     <w:tbl>
       <w:tblPr>
@@ -181,18 +1626,18 @@
                 <wp:inline>
                   <wp:extent cx="152400" cy="152400"/>
                   <wp:effectExtent b="0" l="0" r="0" t="0"/>
-                  <wp:docPr descr="" title="" id="13" name="Picture"/>
+                  <wp:docPr descr="" title="" id="20" name="Picture"/>
                   <a:graphic>
                     <a:graphicData uri="http://schemas.openxmlformats.org/drawingml/2006/picture">
                       <pic:pic>
                         <pic:nvPicPr>
-                          <pic:cNvPr descr="/Applications/quarto/share/formats/docx/note.png" id="14" name="Picture"/>
+                          <pic:cNvPr descr="/Applications/quarto/share/formats/docx/note.png" id="21" name="Picture"/>
                           <pic:cNvPicPr>
                             <a:picLocks noChangeArrowheads="1" noChangeAspect="1"/>
                           </pic:cNvPicPr>
                         </pic:nvPicPr>
                         <pic:blipFill>
-                          <a:blip r:embed="rId12"/>
+                          <a:blip r:embed="rId19"/>
                           <a:stretch>
                             <a:fillRect/>
                           </a:stretch>
@@ -225,7 +1670,22 @@
               <w:t xml:space="preserve"> </w:t>
             </w:r>
             <w:r>
-              <w:t xml:space="preserve">Important Background</w:t>
+              <w:t xml:space="preserve">Why</w:t>
+            </w:r>
+            <w:r>
+              <w:t xml:space="preserve"> </w:t>
+            </w:r>
+            <w:r>
+              <w:rPr>
+                <w:rStyle w:val="VerbatimChar"/>
+              </w:rPr>
+              <w:t xml:space="preserve">!is.na()</w:t>
+            </w:r>
+            <w:r>
+              <w:t xml:space="preserve"> </w:t>
+            </w:r>
+            <w:r>
+              <w:t xml:space="preserve">works</w:t>
             </w:r>
           </w:p>
         </w:tc>
@@ -246,18 +1706,2941 @@
               <w:pStyle w:val="BodyText"/>
             </w:pPr>
             <w:pPr>
-              <w:spacing w:before="16" w:after="16"/>
-            </w:pPr>
-            <w:r>
-              <w:t xml:space="preserve">Stuff to know</w:t>
-            </w:r>
+              <w:spacing w:before="16"/>
+            </w:pPr>
+            <w:r>
+              <w:rPr>
+                <w:rStyle w:val="VerbatimChar"/>
+              </w:rPr>
+              <w:t xml:space="preserve">is.na(x)</w:t>
+            </w:r>
+            <w:r>
+              <w:t xml:space="preserve"> </w:t>
+            </w:r>
+            <w:r>
+              <w:t xml:space="preserve">returns</w:t>
+            </w:r>
+            <w:r>
+              <w:t xml:space="preserve"> </w:t>
+            </w:r>
+            <w:r>
+              <w:rPr>
+                <w:rStyle w:val="VerbatimChar"/>
+              </w:rPr>
+              <w:t xml:space="preserve">TRUE</w:t>
+            </w:r>
+            <w:r>
+              <w:t xml:space="preserve"> </w:t>
+            </w:r>
+            <w:r>
+              <w:t xml:space="preserve">for each missing value and</w:t>
+            </w:r>
+            <w:r>
+              <w:t xml:space="preserve"> </w:t>
+            </w:r>
+            <w:r>
+              <w:rPr>
+                <w:rStyle w:val="VerbatimChar"/>
+              </w:rPr>
+              <w:t xml:space="preserve">FALSE</w:t>
+            </w:r>
+            <w:r>
+              <w:t xml:space="preserve"> </w:t>
+            </w:r>
+            <w:r>
+              <w:t xml:space="preserve">for each real value. The</w:t>
+            </w:r>
+            <w:r>
+              <w:t xml:space="preserve"> </w:t>
+            </w:r>
+            <w:r>
+              <w:rPr>
+                <w:rStyle w:val="VerbatimChar"/>
+              </w:rPr>
+              <w:t xml:space="preserve">!</w:t>
+            </w:r>
+            <w:r>
+              <w:t xml:space="preserve"> </w:t>
+            </w:r>
+            <w:r>
+              <w:t xml:space="preserve">flips those, so</w:t>
+            </w:r>
+            <w:r>
+              <w:t xml:space="preserve"> </w:t>
+            </w:r>
+            <w:r>
+              <w:rPr>
+                <w:rStyle w:val="VerbatimChar"/>
+              </w:rPr>
+              <w:t xml:space="preserve">!is.na(x)</w:t>
+            </w:r>
+            <w:r>
+              <w:t xml:space="preserve"> </w:t>
+            </w:r>
+            <w:r>
+              <w:t xml:space="preserve">is</w:t>
+            </w:r>
+            <w:r>
+              <w:t xml:space="preserve"> </w:t>
+            </w:r>
+            <w:r>
+              <w:rPr>
+                <w:rStyle w:val="VerbatimChar"/>
+              </w:rPr>
+              <w:t xml:space="preserve">TRUE</w:t>
+            </w:r>
+            <w:r>
+              <w:t xml:space="preserve"> </w:t>
+            </w:r>
+            <w:r>
+              <w:t xml:space="preserve">for every real value. Wrapping that in</w:t>
+            </w:r>
+            <w:r>
+              <w:t xml:space="preserve"> </w:t>
+            </w:r>
+            <w:r>
+              <w:rPr>
+                <w:rStyle w:val="VerbatimChar"/>
+              </w:rPr>
+              <w:t xml:space="preserve">sum()</w:t>
+            </w:r>
+            <w:r>
+              <w:t xml:space="preserve"> </w:t>
+            </w:r>
+            <w:r>
+              <w:t xml:space="preserve">adds up the</w:t>
+            </w:r>
+            <w:r>
+              <w:t xml:space="preserve"> </w:t>
+            </w:r>
+            <w:r>
+              <w:rPr>
+                <w:rStyle w:val="VerbatimChar"/>
+              </w:rPr>
+              <w:t xml:space="preserve">TRUE</w:t>
+            </w:r>
+            <w:r>
+              <w:t xml:space="preserve">s — giving you the count of real observations. This is the right way to count</w:t>
+            </w:r>
+            <w:r>
+              <w:t xml:space="preserve"> </w:t>
+            </w:r>
+            <w:r>
+              <w:rPr>
+                <w:i/>
+                <w:iCs/>
+              </w:rPr>
+              <w:t xml:space="preserve">n</w:t>
+            </w:r>
+            <w:r>
+              <w:t xml:space="preserve"> </w:t>
+            </w:r>
+            <w:r>
+              <w:t xml:space="preserve">whenever your data might have gaps.</w:t>
+            </w:r>
+          </w:p>
+          <w:p>
+            <w:pPr>
+              <w:pStyle w:val="BodyText"/>
+            </w:pPr>
+            <w:pPr>
+              <w:spacing w:after="16"/>
+            </w:pPr>
+            <w:r>
+              <w:rPr>
+                <w:b/>
+                <w:bCs/>
+              </w:rPr>
+              <w:t xml:space="preserve">📖 R4DS reference:</w:t>
+            </w:r>
+            <w:r>
+              <w:t xml:space="preserve"> </w:t>
+            </w:r>
+            <w:hyperlink r:id="rId22">
+              <w:r>
+                <w:rPr>
+                  <w:rStyle w:val="Hyperlink"/>
+                </w:rPr>
+                <w:t xml:space="preserve">Chapter 18 — Missing values</w:t>
+              </w:r>
+            </w:hyperlink>
           </w:p>
           <w:p/>
         </w:tc>
       </w:tr>
     </w:tbl>
-    <w:bookmarkEnd w:id="15"/>
-    <w:bookmarkEnd w:id="16"/>
+    <w:p>
+      <w:r>
+        <w:pict>
+          <v:rect style="width:0;height:1.5pt" o:hralign="center" o:hrstd="t" o:hr="t"/>
+        </w:pict>
+      </w:r>
+    </w:p>
+    <w:bookmarkEnd w:id="23"/>
+    <w:bookmarkStart w:id="26" w:name="X1fc5dc3cce42f4f225eab39343e4fdced9dbcee"/>
+    <w:p>
+      <w:pPr>
+        <w:pStyle w:val="Heading1"/>
+      </w:pPr>
+      <w:r>
+        <w:t xml:space="preserve">Part 3 · Descriptive statistics with</w:t>
+      </w:r>
+      <w:r>
+        <w:t xml:space="preserve"> </w:t>
+      </w:r>
+      <w:r>
+        <w:rPr>
+          <w:rStyle w:val="VerbatimChar"/>
+        </w:rPr>
+        <w:t xml:space="preserve">summarize()</w:t>
+      </w:r>
+      <w:r>
+        <w:t xml:space="preserve"> </w:t>
+      </w:r>
+      <w:r>
+        <w:t xml:space="preserve">(→ Lecture 02, Worksheet 02)</w:t>
+      </w:r>
+    </w:p>
+    <w:bookmarkStart w:id="24" w:name="what-do-the-statistics-actually-mean"/>
+    <w:p>
+      <w:pPr>
+        <w:pStyle w:val="Heading3"/>
+      </w:pPr>
+      <w:r>
+        <w:t xml:space="preserve">What do the statistics actually mean?</w:t>
+      </w:r>
+    </w:p>
+    <w:p>
+      <w:pPr>
+        <w:pStyle w:val="FirstParagraph"/>
+      </w:pPr>
+      <w:r>
+        <w:t xml:space="preserve">Before running any code it helps to know what you are calculating:</w:t>
+      </w:r>
+    </w:p>
+    <w:tbl>
+      <w:tblPr>
+        <w:tblStyle w:val="Table"/>
+        <w:tblW w:type="pct" w:w="5000"/>
+        <w:tblLayout w:type="fixed"/>
+        <w:tblLook w:firstRow="1" w:lastRow="0" w:firstColumn="0" w:lastColumn="0" w:noHBand="0" w:noVBand="0" w:val="0020"/>
+      </w:tblPr>
+      <w:tblGrid>
+        <w:gridCol w:w="2200"/>
+        <w:gridCol w:w="1980"/>
+        <w:gridCol w:w="3740"/>
+      </w:tblGrid>
+      <w:tr>
+        <w:trPr>
+          <w:tblHeader w:val="on"/>
+        </w:trPr>
+        <w:tc>
+          <w:tcPr/>
+          <w:p>
+            <w:pPr>
+              <w:pStyle w:val="Compact"/>
+            </w:pPr>
+            <w:r>
+              <w:t xml:space="preserve">Statistic</w:t>
+            </w:r>
+          </w:p>
+        </w:tc>
+        <w:tc>
+          <w:tcPr/>
+          <w:p>
+            <w:pPr>
+              <w:pStyle w:val="Compact"/>
+            </w:pPr>
+            <w:r>
+              <w:t xml:space="preserve">Symbol</w:t>
+            </w:r>
+          </w:p>
+        </w:tc>
+        <w:tc>
+          <w:tcPr/>
+          <w:p>
+            <w:pPr>
+              <w:pStyle w:val="Compact"/>
+            </w:pPr>
+            <w:r>
+              <w:t xml:space="preserve">What it tells you</w:t>
+            </w:r>
+          </w:p>
+        </w:tc>
+      </w:tr>
+      <w:tr>
+        <w:tc>
+          <w:tcPr/>
+          <w:p>
+            <w:pPr>
+              <w:pStyle w:val="Compact"/>
+            </w:pPr>
+            <w:r>
+              <w:t xml:space="preserve">Mean</w:t>
+            </w:r>
+          </w:p>
+        </w:tc>
+        <w:tc>
+          <w:tcPr/>
+          <w:p>
+            <w:pPr>
+              <w:pStyle w:val="Compact"/>
+            </w:pPr>
+            <w:r>
+              <w:t xml:space="preserve">x̄</w:t>
+            </w:r>
+          </w:p>
+        </w:tc>
+        <w:tc>
+          <w:tcPr/>
+          <w:p>
+            <w:pPr>
+              <w:pStyle w:val="Compact"/>
+            </w:pPr>
+            <w:r>
+              <w:t xml:space="preserve">The arithmetic average — add all values, divide by n</w:t>
+            </w:r>
+          </w:p>
+        </w:tc>
+      </w:tr>
+      <w:tr>
+        <w:tc>
+          <w:tcPr/>
+          <w:p>
+            <w:pPr>
+              <w:pStyle w:val="Compact"/>
+            </w:pPr>
+            <w:r>
+              <w:t xml:space="preserve">Median</w:t>
+            </w:r>
+          </w:p>
+        </w:tc>
+        <w:tc>
+          <w:tcPr/>
+          <w:p>
+            <w:pPr>
+              <w:pStyle w:val="Compact"/>
+            </w:pPr>
+            <w:r>
+              <w:t xml:space="preserve">—</w:t>
+            </w:r>
+          </w:p>
+        </w:tc>
+        <w:tc>
+          <w:tcPr/>
+          <w:p>
+            <w:pPr>
+              <w:pStyle w:val="Compact"/>
+            </w:pPr>
+            <w:r>
+              <w:t xml:space="preserve">The middle value when sorted — not pulled by extremes</w:t>
+            </w:r>
+          </w:p>
+        </w:tc>
+      </w:tr>
+      <w:tr>
+        <w:tc>
+          <w:tcPr/>
+          <w:p>
+            <w:pPr>
+              <w:pStyle w:val="Compact"/>
+            </w:pPr>
+            <w:r>
+              <w:t xml:space="preserve">Variance</w:t>
+            </w:r>
+          </w:p>
+        </w:tc>
+        <w:tc>
+          <w:tcPr/>
+          <w:p>
+            <w:pPr>
+              <w:pStyle w:val="Compact"/>
+            </w:pPr>
+            <w:r>
+              <w:t xml:space="preserve">s²</w:t>
+            </w:r>
+          </w:p>
+        </w:tc>
+        <w:tc>
+          <w:tcPr/>
+          <w:p>
+            <w:pPr>
+              <w:pStyle w:val="Compact"/>
+            </w:pPr>
+            <w:r>
+              <w:t xml:space="preserve">Average squared deviation from the mean — in squared units</w:t>
+            </w:r>
+          </w:p>
+        </w:tc>
+      </w:tr>
+      <w:tr>
+        <w:tc>
+          <w:tcPr/>
+          <w:p>
+            <w:pPr>
+              <w:pStyle w:val="Compact"/>
+            </w:pPr>
+            <w:r>
+              <w:t xml:space="preserve">Std dev</w:t>
+            </w:r>
+          </w:p>
+        </w:tc>
+        <w:tc>
+          <w:tcPr/>
+          <w:p>
+            <w:pPr>
+              <w:pStyle w:val="Compact"/>
+            </w:pPr>
+            <w:r>
+              <w:t xml:space="preserve">s</w:t>
+            </w:r>
+          </w:p>
+        </w:tc>
+        <w:tc>
+          <w:tcPr/>
+          <w:p>
+            <w:pPr>
+              <w:pStyle w:val="Compact"/>
+            </w:pPr>
+            <w:r>
+              <w:t xml:space="preserve">Square root of variance — back in the original units</w:t>
+            </w:r>
+          </w:p>
+        </w:tc>
+      </w:tr>
+      <w:tr>
+        <w:tc>
+          <w:tcPr/>
+          <w:p>
+            <w:pPr>
+              <w:pStyle w:val="Compact"/>
+            </w:pPr>
+            <w:r>
+              <w:t xml:space="preserve">Std error</w:t>
+            </w:r>
+          </w:p>
+        </w:tc>
+        <w:tc>
+          <w:tcPr/>
+          <w:p>
+            <w:pPr>
+              <w:pStyle w:val="Compact"/>
+            </w:pPr>
+            <w:r>
+              <w:t xml:space="preserve">SE</w:t>
+            </w:r>
+          </w:p>
+        </w:tc>
+        <w:tc>
+          <w:tcPr/>
+          <w:p>
+            <w:pPr>
+              <w:pStyle w:val="Compact"/>
+            </w:pPr>
+            <w:r>
+              <w:t xml:space="preserve">How much the</w:t>
+            </w:r>
+            <w:r>
+              <w:t xml:space="preserve"> </w:t>
+            </w:r>
+            <w:r>
+              <w:rPr>
+                <w:i/>
+                <w:iCs/>
+              </w:rPr>
+              <w:t xml:space="preserve">mean</w:t>
+            </w:r>
+            <w:r>
+              <w:t xml:space="preserve"> </w:t>
+            </w:r>
+            <w:r>
+              <w:t xml:space="preserve">would vary if you repeated the study; SE = s / √n</w:t>
+            </w:r>
+          </w:p>
+        </w:tc>
+      </w:tr>
+      <w:tr>
+        <w:tc>
+          <w:tcPr/>
+          <w:p>
+            <w:pPr>
+              <w:pStyle w:val="Compact"/>
+            </w:pPr>
+            <w:r>
+              <w:t xml:space="preserve">n</w:t>
+            </w:r>
+          </w:p>
+        </w:tc>
+        <w:tc>
+          <w:tcPr/>
+          <w:p>
+            <w:pPr>
+              <w:pStyle w:val="Compact"/>
+            </w:pPr>
+            <w:r>
+              <w:t xml:space="preserve">n</w:t>
+            </w:r>
+          </w:p>
+        </w:tc>
+        <w:tc>
+          <w:tcPr/>
+          <w:p>
+            <w:pPr>
+              <w:pStyle w:val="Compact"/>
+            </w:pPr>
+            <w:r>
+              <w:t xml:space="preserve">Number of real (non-missing) observations</w:t>
+            </w:r>
+          </w:p>
+        </w:tc>
+      </w:tr>
+    </w:tbl>
+    <w:p>
+      <w:pPr>
+        <w:pStyle w:val="BodyText"/>
+      </w:pPr>
+      <w:r>
+        <w:t xml:space="preserve">The</w:t>
+      </w:r>
+      <w:r>
+        <w:t xml:space="preserve"> </w:t>
+      </w:r>
+      <w:r>
+        <w:rPr>
+          <w:b/>
+          <w:bCs/>
+        </w:rPr>
+        <w:t xml:space="preserve">p-value</w:t>
+      </w:r>
+      <w:r>
+        <w:t xml:space="preserve"> </w:t>
+      </w:r>
+      <w:r>
+        <w:t xml:space="preserve">you will learn to calculate formally later in the course, but here is the idea: if there really were no difference between sunny and shady leaves, how often would you get a difference as large as the one you observed just by chance? A small p-value (typically &lt; 0.05) means that chance alone is unlikely — your data support the alternate hypothesis.</w:t>
+      </w:r>
+    </w:p>
+    <w:bookmarkEnd w:id="24"/>
+    <w:bookmarkStart w:id="25" w:name="run-the-group_by-summarize-pipeline"/>
+    <w:p>
+      <w:pPr>
+        <w:pStyle w:val="Heading3"/>
+      </w:pPr>
+      <w:r>
+        <w:t xml:space="preserve">Run the</w:t>
+      </w:r>
+      <w:r>
+        <w:t xml:space="preserve"> </w:t>
+      </w:r>
+      <w:r>
+        <w:rPr>
+          <w:rStyle w:val="VerbatimChar"/>
+        </w:rPr>
+        <w:t xml:space="preserve">group_by() %&gt;% summarize()</w:t>
+      </w:r>
+      <w:r>
+        <w:t xml:space="preserve"> </w:t>
+      </w:r>
+      <w:r>
+        <w:t xml:space="preserve">pipeline</w:t>
+      </w:r>
+    </w:p>
+    <w:p>
+      <w:pPr>
+        <w:pStyle w:val="FirstParagraph"/>
+      </w:pPr>
+      <w:r>
+        <w:t xml:space="preserve">Complete the pipeline in the skeleton script. After running</w:t>
+      </w:r>
+      <w:r>
+        <w:t xml:space="preserve"> </w:t>
+      </w:r>
+      <w:r>
+        <w:rPr>
+          <w:rStyle w:val="VerbatimChar"/>
+        </w:rPr>
+        <w:t xml:space="preserve">leaf_stats_df</w:t>
+      </w:r>
+      <w:r>
+        <w:t xml:space="preserve">, fill in the table:</w:t>
+      </w:r>
+    </w:p>
+    <w:tbl>
+      <w:tblPr>
+        <w:tblStyle w:val="Table"/>
+        <w:tblW w:type="auto" w:w="0"/>
+        <w:tblLook w:firstRow="1" w:lastRow="0" w:firstColumn="0" w:lastColumn="0" w:noHBand="0" w:noVBand="0" w:val="0020"/>
+      </w:tblPr>
+      <w:tblGrid>
+        <w:gridCol w:w="2640"/>
+        <w:gridCol w:w="2640"/>
+        <w:gridCol w:w="2640"/>
+      </w:tblGrid>
+      <w:tr>
+        <w:trPr>
+          <w:tblHeader w:val="on"/>
+        </w:trPr>
+        <w:tc>
+          <w:tcPr/>
+          <w:p>
+            <w:pPr>
+              <w:pStyle w:val="Compact"/>
+            </w:pPr>
+          </w:p>
+        </w:tc>
+        <w:tc>
+          <w:tcPr/>
+          <w:p>
+            <w:pPr>
+              <w:pStyle w:val="Compact"/>
+            </w:pPr>
+            <w:r>
+              <w:rPr>
+                <w:b/>
+                <w:bCs/>
+              </w:rPr>
+              <w:t xml:space="preserve">Sunny</w:t>
+            </w:r>
+          </w:p>
+        </w:tc>
+        <w:tc>
+          <w:tcPr/>
+          <w:p>
+            <w:pPr>
+              <w:pStyle w:val="Compact"/>
+            </w:pPr>
+            <w:r>
+              <w:rPr>
+                <w:b/>
+                <w:bCs/>
+              </w:rPr>
+              <w:t xml:space="preserve">Shady</w:t>
+            </w:r>
+          </w:p>
+        </w:tc>
+      </w:tr>
+      <w:tr>
+        <w:tc>
+          <w:tcPr/>
+          <w:p>
+            <w:pPr>
+              <w:pStyle w:val="Compact"/>
+            </w:pPr>
+            <w:r>
+              <w:t xml:space="preserve">n (weight_g)</w:t>
+            </w:r>
+          </w:p>
+        </w:tc>
+        <w:tc>
+          <w:tcPr/>
+          <w:p>
+            <w:pPr>
+              <w:pStyle w:val="Compact"/>
+            </w:pPr>
+          </w:p>
+        </w:tc>
+        <w:tc>
+          <w:tcPr/>
+          <w:p>
+            <w:pPr>
+              <w:pStyle w:val="Compact"/>
+            </w:pPr>
+          </w:p>
+        </w:tc>
+      </w:tr>
+      <w:tr>
+        <w:tc>
+          <w:tcPr/>
+          <w:p>
+            <w:pPr>
+              <w:pStyle w:val="Compact"/>
+            </w:pPr>
+            <w:r>
+              <w:t xml:space="preserve">Mean weight (g)</w:t>
+            </w:r>
+          </w:p>
+        </w:tc>
+        <w:tc>
+          <w:tcPr/>
+          <w:p>
+            <w:pPr>
+              <w:pStyle w:val="Compact"/>
+            </w:pPr>
+          </w:p>
+        </w:tc>
+        <w:tc>
+          <w:tcPr/>
+          <w:p>
+            <w:pPr>
+              <w:pStyle w:val="Compact"/>
+            </w:pPr>
+          </w:p>
+        </w:tc>
+      </w:tr>
+      <w:tr>
+        <w:tc>
+          <w:tcPr/>
+          <w:p>
+            <w:pPr>
+              <w:pStyle w:val="Compact"/>
+            </w:pPr>
+            <w:r>
+              <w:t xml:space="preserve">SD weight (g)</w:t>
+            </w:r>
+          </w:p>
+        </w:tc>
+        <w:tc>
+          <w:tcPr/>
+          <w:p>
+            <w:pPr>
+              <w:pStyle w:val="Compact"/>
+            </w:pPr>
+          </w:p>
+        </w:tc>
+        <w:tc>
+          <w:tcPr/>
+          <w:p>
+            <w:pPr>
+              <w:pStyle w:val="Compact"/>
+            </w:pPr>
+          </w:p>
+        </w:tc>
+      </w:tr>
+      <w:tr>
+        <w:tc>
+          <w:tcPr/>
+          <w:p>
+            <w:pPr>
+              <w:pStyle w:val="Compact"/>
+            </w:pPr>
+            <w:r>
+              <w:t xml:space="preserve">SE weight (g)</w:t>
+            </w:r>
+          </w:p>
+        </w:tc>
+        <w:tc>
+          <w:tcPr/>
+          <w:p>
+            <w:pPr>
+              <w:pStyle w:val="Compact"/>
+            </w:pPr>
+          </w:p>
+        </w:tc>
+        <w:tc>
+          <w:tcPr/>
+          <w:p>
+            <w:pPr>
+              <w:pStyle w:val="Compact"/>
+            </w:pPr>
+          </w:p>
+        </w:tc>
+      </w:tr>
+      <w:tr>
+        <w:tc>
+          <w:tcPr/>
+          <w:p>
+            <w:pPr>
+              <w:pStyle w:val="Compact"/>
+            </w:pPr>
+            <w:r>
+              <w:t xml:space="preserve">Mean width (cm)</w:t>
+            </w:r>
+          </w:p>
+        </w:tc>
+        <w:tc>
+          <w:tcPr/>
+          <w:p>
+            <w:pPr>
+              <w:pStyle w:val="Compact"/>
+            </w:pPr>
+          </w:p>
+        </w:tc>
+        <w:tc>
+          <w:tcPr/>
+          <w:p>
+            <w:pPr>
+              <w:pStyle w:val="Compact"/>
+            </w:pPr>
+          </w:p>
+        </w:tc>
+      </w:tr>
+      <w:tr>
+        <w:tc>
+          <w:tcPr/>
+          <w:p>
+            <w:pPr>
+              <w:pStyle w:val="Compact"/>
+            </w:pPr>
+            <w:r>
+              <w:t xml:space="preserve">Mean height (cm)</w:t>
+            </w:r>
+          </w:p>
+        </w:tc>
+        <w:tc>
+          <w:tcPr/>
+          <w:p>
+            <w:pPr>
+              <w:pStyle w:val="Compact"/>
+            </w:pPr>
+          </w:p>
+        </w:tc>
+        <w:tc>
+          <w:tcPr/>
+          <w:p>
+            <w:pPr>
+              <w:pStyle w:val="Compact"/>
+            </w:pPr>
+          </w:p>
+        </w:tc>
+      </w:tr>
+    </w:tbl>
+    <w:p>
+      <w:pPr>
+        <w:pStyle w:val="BlockText"/>
+      </w:pPr>
+      <w:r>
+        <w:rPr>
+          <w:b/>
+          <w:bCs/>
+        </w:rPr>
+        <w:t xml:space="preserve">Q10 — Is the mean weight higher for shady leaves than sunny leaves?</w:t>
+      </w:r>
+      <w:r>
+        <w:t xml:space="preserve"> </w:t>
+      </w:r>
+      <w:r>
+        <w:t xml:space="preserve">Y / N</w:t>
+      </w:r>
+    </w:p>
+    <w:p>
+      <w:pPr>
+        <w:pStyle w:val="BlockText"/>
+      </w:pPr>
+      <w:r>
+        <w:rPr>
+          <w:b/>
+          <w:bCs/>
+        </w:rPr>
+        <w:t xml:space="preserve">Q11 — Difference in mean weight (shady − sunny):</w:t>
+      </w:r>
+      <w:r>
+        <w:t xml:space="preserve"> </w:t>
+      </w:r>
+      <w:r>
+        <w:t xml:space="preserve">________ g</w:t>
+      </w:r>
+    </w:p>
+    <w:p>
+      <w:pPr>
+        <w:pStyle w:val="BlockText"/>
+      </w:pPr>
+      <w:r>
+        <w:rPr>
+          <w:b/>
+          <w:bCs/>
+        </w:rPr>
+        <w:t xml:space="preserve">Q12 — Which side has a larger SE for weight?</w:t>
+      </w:r>
+      <w:r>
+        <w:t xml:space="preserve"> </w:t>
+      </w:r>
+      <w:r>
+        <w:t xml:space="preserve">____________</w:t>
+      </w:r>
+    </w:p>
+    <w:p>
+      <w:pPr>
+        <w:pStyle w:val="BlockText"/>
+      </w:pPr>
+      <w:r>
+        <w:rPr>
+          <w:b/>
+          <w:bCs/>
+        </w:rPr>
+        <w:t xml:space="preserve">Q13 — What does a larger SE tell you about that group?</w:t>
+      </w:r>
+    </w:p>
+    <w:p>
+      <w:r>
+        <w:pict>
+          <v:rect style="width:0;height:1.5pt" o:hralign="center" o:hrstd="t" o:hr="t"/>
+        </w:pict>
+      </w:r>
+    </w:p>
+    <w:p>
+      <w:r>
+        <w:pict>
+          <v:rect style="width:0;height:1.5pt" o:hralign="center" o:hrstd="t" o:hr="t"/>
+        </w:pict>
+      </w:r>
+    </w:p>
+    <w:bookmarkEnd w:id="25"/>
+    <w:bookmarkEnd w:id="26"/>
+    <w:bookmarkStart w:id="27" w:name="X1a13a75a1bfb30cbefa7f52d54666333235cd9c"/>
+    <w:p>
+      <w:pPr>
+        <w:pStyle w:val="Heading1"/>
+      </w:pPr>
+      <w:r>
+        <w:t xml:space="preserve">Part 4 · Quick summary with</w:t>
+      </w:r>
+      <w:r>
+        <w:t xml:space="preserve"> </w:t>
+      </w:r>
+      <w:r>
+        <w:rPr>
+          <w:rStyle w:val="VerbatimChar"/>
+        </w:rPr>
+        <w:t xml:space="preserve">skimr</w:t>
+      </w:r>
+      <w:r>
+        <w:t xml:space="preserve"> </w:t>
+      </w:r>
+      <w:r>
+        <w:t xml:space="preserve">(→ Lecture 02)</w:t>
+      </w:r>
+    </w:p>
+    <w:p>
+      <w:pPr>
+        <w:pStyle w:val="FirstParagraph"/>
+      </w:pPr>
+      <w:r>
+        <w:t xml:space="preserve">The</w:t>
+      </w:r>
+      <w:r>
+        <w:t xml:space="preserve"> </w:t>
+      </w:r>
+      <w:r>
+        <w:rPr>
+          <w:rStyle w:val="VerbatimChar"/>
+        </w:rPr>
+        <w:t xml:space="preserve">skim()</w:t>
+      </w:r>
+      <w:r>
+        <w:t xml:space="preserve"> </w:t>
+      </w:r>
+      <w:r>
+        <w:t xml:space="preserve">function from the</w:t>
+      </w:r>
+      <w:r>
+        <w:t xml:space="preserve"> </w:t>
+      </w:r>
+      <w:r>
+        <w:rPr>
+          <w:rStyle w:val="VerbatimChar"/>
+        </w:rPr>
+        <w:t xml:space="preserve">skimr</w:t>
+      </w:r>
+      <w:r>
+        <w:t xml:space="preserve"> </w:t>
+      </w:r>
+      <w:r>
+        <w:t xml:space="preserve">package gives you a fast, readable overview of an entire data frame — means, missing counts, histograms in text, and more. It is especially handy for a first look at new data.</w:t>
+      </w:r>
+    </w:p>
+    <w:p>
+      <w:pPr>
+        <w:pStyle w:val="BodyText"/>
+      </w:pPr>
+      <w:r>
+        <w:t xml:space="preserve">Run</w:t>
+      </w:r>
+      <w:r>
+        <w:t xml:space="preserve"> </w:t>
+      </w:r>
+      <w:r>
+        <w:rPr>
+          <w:rStyle w:val="VerbatimChar"/>
+        </w:rPr>
+        <w:t xml:space="preserve">skim(leaf_df)</w:t>
+      </w:r>
+      <w:r>
+        <w:t xml:space="preserve"> </w:t>
+      </w:r>
+      <w:r>
+        <w:t xml:space="preserve">in the skeleton.</w:t>
+      </w:r>
+    </w:p>
+    <w:p>
+      <w:pPr>
+        <w:pStyle w:val="BlockText"/>
+      </w:pPr>
+      <w:r>
+        <w:rPr>
+          <w:b/>
+          <w:bCs/>
+        </w:rPr>
+        <w:t xml:space="preserve">Q14 — How many</w:t>
+      </w:r>
+      <w:r>
+        <w:rPr>
+          <w:b/>
+          <w:bCs/>
+        </w:rPr>
+        <w:t xml:space="preserve"> </w:t>
+      </w:r>
+      <w:r>
+        <w:rPr>
+          <w:rStyle w:val="VerbatimChar"/>
+          <w:b/>
+          <w:bCs/>
+        </w:rPr>
+        <w:t xml:space="preserve">NA</w:t>
+      </w:r>
+      <w:r>
+        <w:rPr>
+          <w:b/>
+          <w:bCs/>
+        </w:rPr>
+        <w:t xml:space="preserve"> </w:t>
+      </w:r>
+      <w:r>
+        <w:rPr>
+          <w:b/>
+          <w:bCs/>
+        </w:rPr>
+        <w:t xml:space="preserve">values does</w:t>
+      </w:r>
+      <w:r>
+        <w:rPr>
+          <w:b/>
+          <w:bCs/>
+        </w:rPr>
+        <w:t xml:space="preserve"> </w:t>
+      </w:r>
+      <w:r>
+        <w:rPr>
+          <w:rStyle w:val="VerbatimChar"/>
+          <w:b/>
+          <w:bCs/>
+        </w:rPr>
+        <w:t xml:space="preserve">skim()</w:t>
+      </w:r>
+      <w:r>
+        <w:rPr>
+          <w:b/>
+          <w:bCs/>
+        </w:rPr>
+        <w:t xml:space="preserve"> </w:t>
+      </w:r>
+      <w:r>
+        <w:rPr>
+          <w:b/>
+          <w:bCs/>
+        </w:rPr>
+        <w:t xml:space="preserve">report for</w:t>
+      </w:r>
+      <w:r>
+        <w:rPr>
+          <w:b/>
+          <w:bCs/>
+        </w:rPr>
+        <w:t xml:space="preserve"> </w:t>
+      </w:r>
+      <w:r>
+        <w:rPr>
+          <w:rStyle w:val="VerbatimChar"/>
+          <w:b/>
+          <w:bCs/>
+        </w:rPr>
+        <w:t xml:space="preserve">area_cm2</w:t>
+      </w:r>
+      <w:r>
+        <w:rPr>
+          <w:b/>
+          <w:bCs/>
+        </w:rPr>
+        <w:t xml:space="preserve">?</w:t>
+      </w:r>
+      <w:r>
+        <w:t xml:space="preserve"> </w:t>
+      </w:r>
+      <w:r>
+        <w:t xml:space="preserve">________</w:t>
+      </w:r>
+    </w:p>
+    <w:p>
+      <w:pPr>
+        <w:pStyle w:val="BlockText"/>
+      </w:pPr>
+      <w:r>
+        <w:rPr>
+          <w:b/>
+          <w:bCs/>
+        </w:rPr>
+        <w:t xml:space="preserve">Q15 — Does this match what you found with</w:t>
+      </w:r>
+      <w:r>
+        <w:rPr>
+          <w:b/>
+          <w:bCs/>
+        </w:rPr>
+        <w:t xml:space="preserve"> </w:t>
+      </w:r>
+      <w:r>
+        <w:rPr>
+          <w:rStyle w:val="VerbatimChar"/>
+          <w:b/>
+          <w:bCs/>
+        </w:rPr>
+        <w:t xml:space="preserve">sum(!is.na())</w:t>
+      </w:r>
+      <w:r>
+        <w:rPr>
+          <w:b/>
+          <w:bCs/>
+        </w:rPr>
+        <w:t xml:space="preserve"> </w:t>
+      </w:r>
+      <w:r>
+        <w:rPr>
+          <w:b/>
+          <w:bCs/>
+        </w:rPr>
+        <w:t xml:space="preserve">in Part 2?</w:t>
+      </w:r>
+      <w:r>
+        <w:t xml:space="preserve"> </w:t>
+      </w:r>
+      <w:r>
+        <w:t xml:space="preserve">Y / N</w:t>
+      </w:r>
+    </w:p>
+    <w:p>
+      <w:r>
+        <w:pict>
+          <v:rect style="width:0;height:1.5pt" o:hralign="center" o:hrstd="t" o:hr="t"/>
+        </w:pict>
+      </w:r>
+    </w:p>
+    <w:bookmarkEnd w:id="27"/>
+    <w:bookmarkStart w:id="28" w:name="X567f8f45f55c39a16676298a93180f858e5b68a"/>
+    <w:p>
+      <w:pPr>
+        <w:pStyle w:val="Heading1"/>
+      </w:pPr>
+      <w:r>
+        <w:t xml:space="preserve">Part 5 · The</w:t>
+      </w:r>
+      <w:r>
+        <w:t xml:space="preserve"> </w:t>
+      </w:r>
+      <w:r>
+        <w:rPr>
+          <w:rStyle w:val="VerbatimChar"/>
+        </w:rPr>
+        <w:t xml:space="preserve">[[ ]]</w:t>
+      </w:r>
+      <w:r>
+        <w:t xml:space="preserve"> </w:t>
+      </w:r>
+      <w:r>
+        <w:t xml:space="preserve">shortcut for quick statistics (→ Lecture 02)</w:t>
+      </w:r>
+    </w:p>
+    <w:p>
+      <w:pPr>
+        <w:pStyle w:val="FirstParagraph"/>
+      </w:pPr>
+      <w:r>
+        <w:t xml:space="preserve">When you just want the mean or SE of one column fast — without a full pipeline — you can pull the column out as a vector using</w:t>
+      </w:r>
+      <w:r>
+        <w:t xml:space="preserve"> </w:t>
+      </w:r>
+      <w:r>
+        <w:rPr>
+          <w:rStyle w:val="VerbatimChar"/>
+        </w:rPr>
+        <w:t xml:space="preserve">[[</w:t>
+      </w:r>
+      <w:r>
+        <w:t xml:space="preserve">:</w:t>
+      </w:r>
+    </w:p>
+    <w:p>
+      <w:pPr>
+        <w:pStyle w:val="SourceCode"/>
+      </w:pPr>
+      <w:r>
+        <w:rPr>
+          <w:rStyle w:val="CommentTok"/>
+        </w:rPr>
+        <w:t xml:space="preserve"># Mean of one column — the fast way</w:t>
+      </w:r>
+      <w:r>
+        <w:br/>
+      </w:r>
+      <w:r>
+        <w:rPr>
+          <w:rStyle w:val="FunctionTok"/>
+        </w:rPr>
+        <w:t xml:space="preserve">mean</w:t>
+      </w:r>
+      <w:r>
+        <w:rPr>
+          <w:rStyle w:val="NormalTok"/>
+        </w:rPr>
+        <w:t xml:space="preserve">(leaf_df[[</w:t>
+      </w:r>
+      <w:r>
+        <w:rPr>
+          <w:rStyle w:val="StringTok"/>
+        </w:rPr>
+        <w:t xml:space="preserve">"weight_g"</w:t>
+      </w:r>
+      <w:r>
+        <w:rPr>
+          <w:rStyle w:val="NormalTok"/>
+        </w:rPr>
+        <w:t xml:space="preserve">]], </w:t>
+      </w:r>
+      <w:r>
+        <w:rPr>
+          <w:rStyle w:val="AttributeTok"/>
+        </w:rPr>
+        <w:t xml:space="preserve">na.rm =</w:t>
+      </w:r>
+      <w:r>
+        <w:rPr>
+          <w:rStyle w:val="NormalTok"/>
+        </w:rPr>
+        <w:t xml:space="preserve"> </w:t>
+      </w:r>
+      <w:r>
+        <w:rPr>
+          <w:rStyle w:val="ConstantTok"/>
+        </w:rPr>
+        <w:t xml:space="preserve">TRUE</w:t>
+      </w:r>
+      <w:r>
+        <w:rPr>
+          <w:rStyle w:val="NormalTok"/>
+        </w:rPr>
+        <w:t xml:space="preserve">)</w:t>
+      </w:r>
+      <w:r>
+        <w:br/>
+      </w:r>
+      <w:r>
+        <w:br/>
+      </w:r>
+      <w:r>
+        <w:rPr>
+          <w:rStyle w:val="CommentTok"/>
+        </w:rPr>
+        <w:t xml:space="preserve"># Standard error the same way</w:t>
+      </w:r>
+      <w:r>
+        <w:br/>
+      </w:r>
+      <w:r>
+        <w:rPr>
+          <w:rStyle w:val="FunctionTok"/>
+        </w:rPr>
+        <w:t xml:space="preserve">sd</w:t>
+      </w:r>
+      <w:r>
+        <w:rPr>
+          <w:rStyle w:val="NormalTok"/>
+        </w:rPr>
+        <w:t xml:space="preserve">(leaf_df[[</w:t>
+      </w:r>
+      <w:r>
+        <w:rPr>
+          <w:rStyle w:val="StringTok"/>
+        </w:rPr>
+        <w:t xml:space="preserve">"weight_g"</w:t>
+      </w:r>
+      <w:r>
+        <w:rPr>
+          <w:rStyle w:val="NormalTok"/>
+        </w:rPr>
+        <w:t xml:space="preserve">]], </w:t>
+      </w:r>
+      <w:r>
+        <w:rPr>
+          <w:rStyle w:val="AttributeTok"/>
+        </w:rPr>
+        <w:t xml:space="preserve">na.rm =</w:t>
+      </w:r>
+      <w:r>
+        <w:rPr>
+          <w:rStyle w:val="NormalTok"/>
+        </w:rPr>
+        <w:t xml:space="preserve"> </w:t>
+      </w:r>
+      <w:r>
+        <w:rPr>
+          <w:rStyle w:val="ConstantTok"/>
+        </w:rPr>
+        <w:t xml:space="preserve">TRUE</w:t>
+      </w:r>
+      <w:r>
+        <w:rPr>
+          <w:rStyle w:val="NormalTok"/>
+        </w:rPr>
+        <w:t xml:space="preserve">) </w:t>
+      </w:r>
+      <w:r>
+        <w:rPr>
+          <w:rStyle w:val="SpecialCharTok"/>
+        </w:rPr>
+        <w:t xml:space="preserve">/</w:t>
+      </w:r>
+      <w:r>
+        <w:br/>
+      </w:r>
+      <w:r>
+        <w:rPr>
+          <w:rStyle w:val="NormalTok"/>
+        </w:rPr>
+        <w:t xml:space="preserve">  </w:t>
+      </w:r>
+      <w:r>
+        <w:rPr>
+          <w:rStyle w:val="FunctionTok"/>
+        </w:rPr>
+        <w:t xml:space="preserve">sqrt</w:t>
+      </w:r>
+      <w:r>
+        <w:rPr>
+          <w:rStyle w:val="NormalTok"/>
+        </w:rPr>
+        <w:t xml:space="preserve">(</w:t>
+      </w:r>
+      <w:r>
+        <w:rPr>
+          <w:rStyle w:val="FunctionTok"/>
+        </w:rPr>
+        <w:t xml:space="preserve">sum</w:t>
+      </w:r>
+      <w:r>
+        <w:rPr>
+          <w:rStyle w:val="NormalTok"/>
+        </w:rPr>
+        <w:t xml:space="preserve">(</w:t>
+      </w:r>
+      <w:r>
+        <w:rPr>
+          <w:rStyle w:val="SpecialCharTok"/>
+        </w:rPr>
+        <w:t xml:space="preserve">!</w:t>
+      </w:r>
+      <w:r>
+        <w:rPr>
+          <w:rStyle w:val="FunctionTok"/>
+        </w:rPr>
+        <w:t xml:space="preserve">is.na</w:t>
+      </w:r>
+      <w:r>
+        <w:rPr>
+          <w:rStyle w:val="NormalTok"/>
+        </w:rPr>
+        <w:t xml:space="preserve">(leaf_df[[</w:t>
+      </w:r>
+      <w:r>
+        <w:rPr>
+          <w:rStyle w:val="StringTok"/>
+        </w:rPr>
+        <w:t xml:space="preserve">"weight_g"</w:t>
+      </w:r>
+      <w:r>
+        <w:rPr>
+          <w:rStyle w:val="NormalTok"/>
+        </w:rPr>
+        <w:t xml:space="preserve">]])))</w:t>
+      </w:r>
+    </w:p>
+    <w:p>
+      <w:pPr>
+        <w:pStyle w:val="FirstParagraph"/>
+      </w:pPr>
+      <w:r>
+        <w:rPr>
+          <w:rStyle w:val="VerbatimChar"/>
+        </w:rPr>
+        <w:t xml:space="preserve">leaf_df[["weight_g"]]</w:t>
+      </w:r>
+      <w:r>
+        <w:t xml:space="preserve"> </w:t>
+      </w:r>
+      <w:r>
+        <w:t xml:space="preserve">extracts the</w:t>
+      </w:r>
+      <w:r>
+        <w:t xml:space="preserve"> </w:t>
+      </w:r>
+      <w:r>
+        <w:rPr>
+          <w:rStyle w:val="VerbatimChar"/>
+        </w:rPr>
+        <w:t xml:space="preserve">weight_g</w:t>
+      </w:r>
+      <w:r>
+        <w:t xml:space="preserve"> </w:t>
+      </w:r>
+      <w:r>
+        <w:t xml:space="preserve">column as a plain vector. This is the most direct path to a single number — useful for quick checks.</w:t>
+      </w:r>
+    </w:p>
+    <w:p>
+      <w:pPr>
+        <w:pStyle w:val="BodyText"/>
+      </w:pPr>
+      <w:r>
+        <w:t xml:space="preserve">Run the four lines in the skeleton (mean, SD, n, SE for</w:t>
+      </w:r>
+      <w:r>
+        <w:t xml:space="preserve"> </w:t>
+      </w:r>
+      <w:r>
+        <w:rPr>
+          <w:rStyle w:val="VerbatimChar"/>
+        </w:rPr>
+        <w:t xml:space="preserve">weight_g</w:t>
+      </w:r>
+      <w:r>
+        <w:t xml:space="preserve"> </w:t>
+      </w:r>
+      <w:r>
+        <w:t xml:space="preserve">across all leaves combined) and answer:</w:t>
+      </w:r>
+    </w:p>
+    <w:p>
+      <w:pPr>
+        <w:pStyle w:val="BlockText"/>
+      </w:pPr>
+      <w:r>
+        <w:rPr>
+          <w:b/>
+          <w:bCs/>
+        </w:rPr>
+        <w:t xml:space="preserve">Q16 — Overall mean leaf weight (all leaves, both sides):</w:t>
+      </w:r>
+      <w:r>
+        <w:t xml:space="preserve"> </w:t>
+      </w:r>
+      <w:r>
+        <w:t xml:space="preserve">________ g</w:t>
+      </w:r>
+    </w:p>
+    <w:p>
+      <w:pPr>
+        <w:pStyle w:val="BlockText"/>
+      </w:pPr>
+      <w:r>
+        <w:rPr>
+          <w:b/>
+          <w:bCs/>
+        </w:rPr>
+        <w:t xml:space="preserve">Q17 — Overall SE of leaf weight:</w:t>
+      </w:r>
+      <w:r>
+        <w:t xml:space="preserve"> </w:t>
+      </w:r>
+      <w:r>
+        <w:t xml:space="preserve">________ g</w:t>
+      </w:r>
+    </w:p>
+    <w:p>
+      <w:pPr>
+        <w:pStyle w:val="BlockText"/>
+      </w:pPr>
+      <w:r>
+        <w:rPr>
+          <w:b/>
+          <w:bCs/>
+        </w:rPr>
+        <w:t xml:space="preserve">Q18 — Why do we write</w:t>
+      </w:r>
+      <w:r>
+        <w:rPr>
+          <w:b/>
+          <w:bCs/>
+        </w:rPr>
+        <w:t xml:space="preserve"> </w:t>
+      </w:r>
+      <w:r>
+        <w:rPr>
+          <w:rStyle w:val="VerbatimChar"/>
+          <w:b/>
+          <w:bCs/>
+        </w:rPr>
+        <w:t xml:space="preserve">na.rm = TRUE</w:t>
+      </w:r>
+      <w:r>
+        <w:rPr>
+          <w:b/>
+          <w:bCs/>
+        </w:rPr>
+        <w:t xml:space="preserve"> </w:t>
+      </w:r>
+      <w:r>
+        <w:rPr>
+          <w:b/>
+          <w:bCs/>
+        </w:rPr>
+        <w:t xml:space="preserve">inside</w:t>
+      </w:r>
+      <w:r>
+        <w:rPr>
+          <w:b/>
+          <w:bCs/>
+        </w:rPr>
+        <w:t xml:space="preserve"> </w:t>
+      </w:r>
+      <w:r>
+        <w:rPr>
+          <w:rStyle w:val="VerbatimChar"/>
+          <w:b/>
+          <w:bCs/>
+        </w:rPr>
+        <w:t xml:space="preserve">mean()</w:t>
+      </w:r>
+      <w:r>
+        <w:rPr>
+          <w:b/>
+          <w:bCs/>
+        </w:rPr>
+        <w:t xml:space="preserve"> </w:t>
+      </w:r>
+      <w:r>
+        <w:rPr>
+          <w:b/>
+          <w:bCs/>
+        </w:rPr>
+        <w:t xml:space="preserve">and</w:t>
+      </w:r>
+      <w:r>
+        <w:rPr>
+          <w:b/>
+          <w:bCs/>
+        </w:rPr>
+        <w:t xml:space="preserve"> </w:t>
+      </w:r>
+      <w:r>
+        <w:rPr>
+          <w:rStyle w:val="VerbatimChar"/>
+          <w:b/>
+          <w:bCs/>
+        </w:rPr>
+        <w:t xml:space="preserve">sd()</w:t>
+      </w:r>
+      <w:r>
+        <w:rPr>
+          <w:b/>
+          <w:bCs/>
+        </w:rPr>
+        <w:t xml:space="preserve">?</w:t>
+      </w:r>
+    </w:p>
+    <w:p>
+      <w:r>
+        <w:pict>
+          <v:rect style="width:0;height:1.5pt" o:hralign="center" o:hrstd="t" o:hr="t"/>
+        </w:pict>
+      </w:r>
+    </w:p>
+    <w:p>
+      <w:r>
+        <w:pict>
+          <v:rect style="width:0;height:1.5pt" o:hralign="center" o:hrstd="t" o:hr="t"/>
+        </w:pict>
+      </w:r>
+    </w:p>
+    <w:bookmarkEnd w:id="28"/>
+    <w:bookmarkStart w:id="29" w:name="Xc52b1a2a8f0a1c92fada117b1804e88bffd4e2c"/>
+    <w:p>
+      <w:pPr>
+        <w:pStyle w:val="Heading1"/>
+      </w:pPr>
+      <w:r>
+        <w:t xml:space="preserve">Part 6 · Boxplot with jittered points (→ Lecture 02, Worksheet 02)</w:t>
+      </w:r>
+    </w:p>
+    <w:p>
+      <w:pPr>
+        <w:pStyle w:val="FirstParagraph"/>
+      </w:pPr>
+      <w:r>
+        <w:t xml:space="preserve">A boxplot shows the median, quartiles, and outliers. Overlaying the individual points lets you see how many observations are behind each box — an important check when sample sizes are small.</w:t>
+      </w:r>
+    </w:p>
+    <w:p>
+      <w:pPr>
+        <w:pStyle w:val="BodyText"/>
+      </w:pPr>
+      <w:r>
+        <w:t xml:space="preserve">Complete the boxplot code in the skeleton and save it as a PNG.</w:t>
+      </w:r>
+    </w:p>
+    <w:p>
+      <w:pPr>
+        <w:pStyle w:val="BodyText"/>
+      </w:pPr>
+      <w:r>
+        <w:t xml:space="preserve">Describe what you see:</w:t>
+      </w:r>
+    </w:p>
+    <w:p>
+      <w:pPr>
+        <w:pStyle w:val="BlockText"/>
+      </w:pPr>
+      <w:r>
+        <w:rPr>
+          <w:b/>
+          <w:bCs/>
+        </w:rPr>
+        <w:t xml:space="preserve">Q19 — Which side has a higher median weight (from the box)?</w:t>
+      </w:r>
+      <w:r>
+        <w:t xml:space="preserve"> </w:t>
+      </w:r>
+      <w:r>
+        <w:t xml:space="preserve">________</w:t>
+      </w:r>
+    </w:p>
+    <w:p>
+      <w:pPr>
+        <w:pStyle w:val="BlockText"/>
+      </w:pPr>
+      <w:r>
+        <w:rPr>
+          <w:b/>
+          <w:bCs/>
+        </w:rPr>
+        <w:t xml:space="preserve">Q20 — Do the boxes overlap substantially, somewhat, or not at all?</w:t>
+      </w:r>
+      <w:r>
+        <w:t xml:space="preserve"> </w:t>
+      </w:r>
+      <w:r>
+        <w:t xml:space="preserve">________________</w:t>
+      </w:r>
+    </w:p>
+    <w:p>
+      <w:pPr>
+        <w:pStyle w:val="BlockText"/>
+      </w:pPr>
+      <w:r>
+        <w:rPr>
+          <w:b/>
+          <w:bCs/>
+        </w:rPr>
+        <w:t xml:space="preserve">Q21 — Approximate median weight for sunny leaves (read from the box):</w:t>
+      </w:r>
+      <w:r>
+        <w:t xml:space="preserve"> </w:t>
+      </w:r>
+      <w:r>
+        <w:t xml:space="preserve">________ g</w:t>
+      </w:r>
+    </w:p>
+    <w:p>
+      <w:pPr>
+        <w:pStyle w:val="BlockText"/>
+      </w:pPr>
+      <w:r>
+        <w:rPr>
+          <w:b/>
+          <w:bCs/>
+        </w:rPr>
+        <w:t xml:space="preserve">Q22 — Approximate median weight for shady leaves (read from the box):</w:t>
+      </w:r>
+      <w:r>
+        <w:t xml:space="preserve"> </w:t>
+      </w:r>
+      <w:r>
+        <w:t xml:space="preserve">________ g</w:t>
+      </w:r>
+    </w:p>
+    <w:p>
+      <w:pPr>
+        <w:pStyle w:val="BlockText"/>
+      </w:pPr>
+      <w:r>
+        <w:rPr>
+          <w:b/>
+          <w:bCs/>
+        </w:rPr>
+        <w:t xml:space="preserve">Q23 — Looking at the individual points, are there any leaves that seem unusually large or small (possible outliers)?</w:t>
+      </w:r>
+      <w:r>
+        <w:t xml:space="preserve"> </w:t>
+      </w:r>
+      <w:r>
+        <w:t xml:space="preserve">Y / N If yes, which side?</w:t>
+      </w:r>
+    </w:p>
+    <w:p>
+      <w:r>
+        <w:pict>
+          <v:rect style="width:0;height:1.5pt" o:hralign="center" o:hrstd="t" o:hr="t"/>
+        </w:pict>
+      </w:r>
+    </w:p>
+    <w:bookmarkEnd w:id="29"/>
+    <w:bookmarkStart w:id="30" w:name="X0b5c92a3f24f1fd6a7c5f64c3f135abb299be68"/>
+    <w:p>
+      <w:pPr>
+        <w:pStyle w:val="Heading1"/>
+      </w:pPr>
+      <w:r>
+        <w:t xml:space="preserve">Part 7 · Mean ± SE plot with</w:t>
+      </w:r>
+      <w:r>
+        <w:t xml:space="preserve"> </w:t>
+      </w:r>
+      <w:r>
+        <w:rPr>
+          <w:rStyle w:val="VerbatimChar"/>
+        </w:rPr>
+        <w:t xml:space="preserve">stat_summary</w:t>
+      </w:r>
+      <w:r>
+        <w:t xml:space="preserve"> </w:t>
+      </w:r>
+      <w:r>
+        <w:t xml:space="preserve">(→ Lecture 02, Worksheet 02)</w:t>
+      </w:r>
+    </w:p>
+    <w:p>
+      <w:pPr>
+        <w:pStyle w:val="FirstParagraph"/>
+      </w:pPr>
+      <w:r>
+        <w:t xml:space="preserve">A mean ± SE plot is often used in biology to show whether two group means are different. If the SE bars do not overlap at all, the difference is likely meaningful — though you will not know for sure until you run a formal test.</w:t>
+      </w:r>
+    </w:p>
+    <w:p>
+      <w:pPr>
+        <w:pStyle w:val="BodyText"/>
+      </w:pPr>
+      <w:r>
+        <w:t xml:space="preserve">Complete the</w:t>
+      </w:r>
+      <w:r>
+        <w:t xml:space="preserve"> </w:t>
+      </w:r>
+      <w:r>
+        <w:rPr>
+          <w:rStyle w:val="VerbatimChar"/>
+        </w:rPr>
+        <w:t xml:space="preserve">stat_summary</w:t>
+      </w:r>
+      <w:r>
+        <w:t xml:space="preserve"> </w:t>
+      </w:r>
+      <w:r>
+        <w:t xml:space="preserve">plot in the skeleton and save it as a PNG.</w:t>
+      </w:r>
+    </w:p>
+    <w:p>
+      <w:pPr>
+        <w:pStyle w:val="BlockText"/>
+      </w:pPr>
+      <w:r>
+        <w:rPr>
+          <w:b/>
+          <w:bCs/>
+        </w:rPr>
+        <w:t xml:space="preserve">Q24 — Do the SE error bars for sunny and shady overlap?</w:t>
+      </w:r>
+      <w:r>
+        <w:t xml:space="preserve"> </w:t>
+      </w:r>
+      <w:r>
+        <w:t xml:space="preserve">Y / N</w:t>
+      </w:r>
+    </w:p>
+    <w:p>
+      <w:pPr>
+        <w:pStyle w:val="BlockText"/>
+      </w:pPr>
+      <w:r>
+        <w:rPr>
+          <w:b/>
+          <w:bCs/>
+        </w:rPr>
+        <w:t xml:space="preserve">Q25 — Based on the mean ± SE plot and your descriptive statistics, does the data appear to support the alternate hypothesis (shady leaves are larger)?</w:t>
+      </w:r>
+      <w:r>
+        <w:t xml:space="preserve"> </w:t>
+      </w:r>
+      <w:r>
+        <w:t xml:space="preserve">Y / N Explain in one sentence:</w:t>
+      </w:r>
+    </w:p>
+    <w:p>
+      <w:r>
+        <w:pict>
+          <v:rect style="width:0;height:1.5pt" o:hralign="center" o:hrstd="t" o:hr="t"/>
+        </w:pict>
+      </w:r>
+    </w:p>
+    <w:p>
+      <w:r>
+        <w:pict>
+          <v:rect style="width:0;height:1.5pt" o:hralign="center" o:hrstd="t" o:hr="t"/>
+        </w:pict>
+      </w:r>
+    </w:p>
+    <w:p>
+      <w:r>
+        <w:pict>
+          <v:rect style="width:0;height:1.5pt" o:hralign="center" o:hrstd="t" o:hr="t"/>
+        </w:pict>
+      </w:r>
+    </w:p>
+    <w:bookmarkEnd w:id="30"/>
+    <w:bookmarkStart w:id="31" w:name="part-8-connecting-back-to-the-science"/>
+    <w:p>
+      <w:pPr>
+        <w:pStyle w:val="Heading1"/>
+      </w:pPr>
+      <w:r>
+        <w:t xml:space="preserve">Part 8 · Connecting back to the science</w:t>
+      </w:r>
+    </w:p>
+    <w:p>
+      <w:pPr>
+        <w:pStyle w:val="FirstParagraph"/>
+      </w:pPr>
+      <w:r>
+        <w:t xml:space="preserve">Answer these questions in your own words. There are no wrong answers — we are thinking like scientists.</w:t>
+      </w:r>
+    </w:p>
+    <w:p>
+      <w:pPr>
+        <w:pStyle w:val="BlockText"/>
+      </w:pPr>
+      <w:r>
+        <w:rPr>
+          <w:b/>
+          <w:bCs/>
+        </w:rPr>
+        <w:t xml:space="preserve">Q26 — Restate the null hypothesis in your own words:</w:t>
+      </w:r>
+    </w:p>
+    <w:p>
+      <w:r>
+        <w:pict>
+          <v:rect style="width:0;height:1.5pt" o:hralign="center" o:hrstd="t" o:hr="t"/>
+        </w:pict>
+      </w:r>
+    </w:p>
+    <w:p>
+      <w:pPr>
+        <w:pStyle w:val="BlockText"/>
+      </w:pPr>
+      <w:r>
+        <w:rPr>
+          <w:b/>
+          <w:bCs/>
+        </w:rPr>
+        <w:t xml:space="preserve">Q27 — Restate the alternate hypothesis in your own words:</w:t>
+      </w:r>
+    </w:p>
+    <w:p>
+      <w:r>
+        <w:pict>
+          <v:rect style="width:0;height:1.5pt" o:hralign="center" o:hrstd="t" o:hr="t"/>
+        </w:pict>
+      </w:r>
+    </w:p>
+    <w:p>
+      <w:pPr>
+        <w:pStyle w:val="BlockText"/>
+      </w:pPr>
+      <w:r>
+        <w:rPr>
+          <w:b/>
+          <w:bCs/>
+        </w:rPr>
+        <w:t xml:space="preserve">Q28 — Why do shady leaves need to be larger to survive? (Think about what a leaf does and what it has less of on the shady side.)</w:t>
+      </w:r>
+    </w:p>
+    <w:p>
+      <w:r>
+        <w:pict>
+          <v:rect style="width:0;height:1.5pt" o:hralign="center" o:hrstd="t" o:hr="t"/>
+        </w:pict>
+      </w:r>
+    </w:p>
+    <w:p>
+      <w:r>
+        <w:pict>
+          <v:rect style="width:0;height:1.5pt" o:hralign="center" o:hrstd="t" o:hr="t"/>
+        </w:pict>
+      </w:r>
+    </w:p>
+    <w:p>
+      <w:pPr>
+        <w:pStyle w:val="BlockText"/>
+      </w:pPr>
+      <w:r>
+        <w:rPr>
+          <w:b/>
+          <w:bCs/>
+        </w:rPr>
+        <w:t xml:space="preserve">Q29 — Your class measured leaves from multiple trees. Why is it important to measure leaves from more than one tree rather than just one tree?</w:t>
+      </w:r>
+    </w:p>
+    <w:p>
+      <w:r>
+        <w:pict>
+          <v:rect style="width:0;height:1.5pt" o:hralign="center" o:hrstd="t" o:hr="t"/>
+        </w:pict>
+      </w:r>
+    </w:p>
+    <w:p>
+      <w:r>
+        <w:pict>
+          <v:rect style="width:0;height:1.5pt" o:hralign="center" o:hrstd="t" o:hr="t"/>
+        </w:pict>
+      </w:r>
+    </w:p>
+    <w:p>
+      <w:r>
+        <w:pict>
+          <v:rect style="width:0;height:1.5pt" o:hralign="center" o:hrstd="t" o:hr="t"/>
+        </w:pict>
+      </w:r>
+    </w:p>
+    <w:bookmarkEnd w:id="31"/>
+    <w:bookmarkStart w:id="32" w:name="submission-checklist"/>
+    <w:p>
+      <w:pPr>
+        <w:pStyle w:val="Heading1"/>
+      </w:pPr>
+      <w:r>
+        <w:t xml:space="preserve">Submission checklist</w:t>
+      </w:r>
+    </w:p>
+    <w:p>
+      <w:pPr>
+        <w:pStyle w:val="FirstParagraph"/>
+      </w:pPr>
+      <w:r>
+        <w:t xml:space="preserve">Before uploading to Canvas, confirm:</w:t>
+      </w:r>
+    </w:p>
+    <w:p>
+      <w:pPr>
+        <w:pStyle w:val="Compact"/>
+        <w:numPr>
+          <w:ilvl w:val="0"/>
+          <w:numId w:val="1002"/>
+        </w:numPr>
+      </w:pPr>
+      <w:r>
+        <w:rPr>
+          <w:rStyle w:val="VerbatimChar"/>
+        </w:rPr>
+        <w:t xml:space="preserve">01_leaves.R</w:t>
+      </w:r>
+      <w:r>
+        <w:t xml:space="preserve"> </w:t>
+      </w:r>
+      <w:r>
+        <w:t xml:space="preserve">runs top to bottom without errors (</w:t>
+      </w:r>
+      <w:r>
+        <w:rPr>
+          <w:b/>
+          <w:bCs/>
+        </w:rPr>
+        <w:t xml:space="preserve">Ctrl/Cmd + Shift + Enter</w:t>
+      </w:r>
+      <w:r>
+        <w:t xml:space="preserve">)</w:t>
+      </w:r>
+    </w:p>
+    <w:p>
+      <w:pPr>
+        <w:pStyle w:val="Compact"/>
+        <w:numPr>
+          <w:ilvl w:val="0"/>
+          <w:numId w:val="1003"/>
+        </w:numPr>
+      </w:pPr>
+      <w:r>
+        <w:t xml:space="preserve">All</w:t>
+      </w:r>
+      <w:r>
+        <w:t xml:space="preserve"> </w:t>
+      </w:r>
+      <w:r>
+        <w:rPr>
+          <w:rStyle w:val="VerbatimChar"/>
+        </w:rPr>
+        <w:t xml:space="preserve"># Q__</w:t>
+      </w:r>
+      <w:r>
+        <w:t xml:space="preserve"> </w:t>
+      </w:r>
+      <w:r>
+        <w:t xml:space="preserve">answers are filled in the script as comments</w:t>
+      </w:r>
+    </w:p>
+    <w:p>
+      <w:pPr>
+        <w:pStyle w:val="Compact"/>
+        <w:numPr>
+          <w:ilvl w:val="0"/>
+          <w:numId w:val="1004"/>
+        </w:numPr>
+      </w:pPr>
+      <w:r>
+        <w:rPr>
+          <w:rStyle w:val="VerbatimChar"/>
+        </w:rPr>
+        <w:t xml:space="preserve">figures/leaf_weight_boxplot.png</w:t>
+      </w:r>
+      <w:r>
+        <w:t xml:space="preserve"> </w:t>
+      </w:r>
+      <w:r>
+        <w:t xml:space="preserve">exists (6 × 6 in, dpi = 300)</w:t>
+      </w:r>
+    </w:p>
+    <w:p>
+      <w:pPr>
+        <w:pStyle w:val="Compact"/>
+        <w:numPr>
+          <w:ilvl w:val="0"/>
+          <w:numId w:val="1005"/>
+        </w:numPr>
+      </w:pPr>
+      <w:r>
+        <w:rPr>
+          <w:rStyle w:val="VerbatimChar"/>
+        </w:rPr>
+        <w:t xml:space="preserve">figures/leaf_weight_mean_se.png</w:t>
+      </w:r>
+      <w:r>
+        <w:t xml:space="preserve"> </w:t>
+      </w:r>
+      <w:r>
+        <w:t xml:space="preserve">exists (6 × 6 in, dpi = 300)</w:t>
+      </w:r>
+    </w:p>
+    <w:p>
+      <w:pPr>
+        <w:pStyle w:val="Compact"/>
+        <w:numPr>
+          <w:ilvl w:val="0"/>
+          <w:numId w:val="1006"/>
+        </w:numPr>
+      </w:pPr>
+      <w:r>
+        <w:t xml:space="preserve">Questions Q26–Q29 are written in your own words</w:t>
+      </w:r>
+    </w:p>
+    <w:p>
+      <w:r>
+        <w:pict>
+          <v:rect style="width:0;height:1.5pt" o:hralign="center" o:hrstd="t" o:hr="t"/>
+        </w:pict>
+      </w:r>
+    </w:p>
+    <w:bookmarkEnd w:id="32"/>
+    <w:bookmarkStart w:id="35" w:name="going-further-optional-no-points"/>
+    <w:p>
+      <w:pPr>
+        <w:pStyle w:val="Heading1"/>
+      </w:pPr>
+      <w:r>
+        <w:t xml:space="preserve">Going further (optional — no points)</w:t>
+      </w:r>
+    </w:p>
+    <w:bookmarkStart w:id="33" w:name="make-a-scatter-plot-of-width-vs.-height"/>
+    <w:p>
+      <w:pPr>
+        <w:pStyle w:val="Heading3"/>
+      </w:pPr>
+      <w:r>
+        <w:t xml:space="preserve">Make a scatter plot of width vs. height</w:t>
+      </w:r>
+    </w:p>
+    <w:p>
+      <w:pPr>
+        <w:pStyle w:val="FirstParagraph"/>
+      </w:pPr>
+      <w:r>
+        <w:t xml:space="preserve">Does wider also mean taller? Try this in your script:</w:t>
+      </w:r>
+    </w:p>
+    <w:p>
+      <w:pPr>
+        <w:pStyle w:val="SourceCode"/>
+      </w:pPr>
+      <w:r>
+        <w:rPr>
+          <w:rStyle w:val="NormalTok"/>
+        </w:rPr>
+        <w:t xml:space="preserve">scatter_plot </w:t>
+      </w:r>
+      <w:r>
+        <w:rPr>
+          <w:rStyle w:val="OtherTok"/>
+        </w:rPr>
+        <w:t xml:space="preserve">&lt;-</w:t>
+      </w:r>
+      <w:r>
+        <w:rPr>
+          <w:rStyle w:val="NormalTok"/>
+        </w:rPr>
+        <w:t xml:space="preserve"> </w:t>
+      </w:r>
+      <w:r>
+        <w:rPr>
+          <w:rStyle w:val="FunctionTok"/>
+        </w:rPr>
+        <w:t xml:space="preserve">ggplot</w:t>
+      </w:r>
+      <w:r>
+        <w:rPr>
+          <w:rStyle w:val="NormalTok"/>
+        </w:rPr>
+        <w:t xml:space="preserve">(leaf_df, </w:t>
+      </w:r>
+      <w:r>
+        <w:rPr>
+          <w:rStyle w:val="FunctionTok"/>
+        </w:rPr>
+        <w:t xml:space="preserve">aes</w:t>
+      </w:r>
+      <w:r>
+        <w:rPr>
+          <w:rStyle w:val="NormalTok"/>
+        </w:rPr>
+        <w:t xml:space="preserve">(</w:t>
+      </w:r>
+      <w:r>
+        <w:rPr>
+          <w:rStyle w:val="AttributeTok"/>
+        </w:rPr>
+        <w:t xml:space="preserve">x =</w:t>
+      </w:r>
+      <w:r>
+        <w:rPr>
+          <w:rStyle w:val="NormalTok"/>
+        </w:rPr>
+        <w:t xml:space="preserve"> width_cm, </w:t>
+      </w:r>
+      <w:r>
+        <w:rPr>
+          <w:rStyle w:val="AttributeTok"/>
+        </w:rPr>
+        <w:t xml:space="preserve">y =</w:t>
+      </w:r>
+      <w:r>
+        <w:rPr>
+          <w:rStyle w:val="NormalTok"/>
+        </w:rPr>
+        <w:t xml:space="preserve"> height_cm, </w:t>
+      </w:r>
+      <w:r>
+        <w:rPr>
+          <w:rStyle w:val="AttributeTok"/>
+        </w:rPr>
+        <w:t xml:space="preserve">color =</w:t>
+      </w:r>
+      <w:r>
+        <w:rPr>
+          <w:rStyle w:val="NormalTok"/>
+        </w:rPr>
+        <w:t xml:space="preserve"> side)) </w:t>
+      </w:r>
+      <w:r>
+        <w:rPr>
+          <w:rStyle w:val="SpecialCharTok"/>
+        </w:rPr>
+        <w:t xml:space="preserve">+</w:t>
+      </w:r>
+      <w:r>
+        <w:br/>
+      </w:r>
+      <w:r>
+        <w:rPr>
+          <w:rStyle w:val="NormalTok"/>
+        </w:rPr>
+        <w:t xml:space="preserve">  </w:t>
+      </w:r>
+      <w:r>
+        <w:rPr>
+          <w:rStyle w:val="FunctionTok"/>
+        </w:rPr>
+        <w:t xml:space="preserve">geom_point</w:t>
+      </w:r>
+      <w:r>
+        <w:rPr>
+          <w:rStyle w:val="NormalTok"/>
+        </w:rPr>
+        <w:t xml:space="preserve">(</w:t>
+      </w:r>
+      <w:r>
+        <w:rPr>
+          <w:rStyle w:val="AttributeTok"/>
+        </w:rPr>
+        <w:t xml:space="preserve">size =</w:t>
+      </w:r>
+      <w:r>
+        <w:rPr>
+          <w:rStyle w:val="NormalTok"/>
+        </w:rPr>
+        <w:t xml:space="preserve"> </w:t>
+      </w:r>
+      <w:r>
+        <w:rPr>
+          <w:rStyle w:val="DecValTok"/>
+        </w:rPr>
+        <w:t xml:space="preserve">3</w:t>
+      </w:r>
+      <w:r>
+        <w:rPr>
+          <w:rStyle w:val="NormalTok"/>
+        </w:rPr>
+        <w:t xml:space="preserve">, </w:t>
+      </w:r>
+      <w:r>
+        <w:rPr>
+          <w:rStyle w:val="AttributeTok"/>
+        </w:rPr>
+        <w:t xml:space="preserve">alpha =</w:t>
+      </w:r>
+      <w:r>
+        <w:rPr>
+          <w:rStyle w:val="NormalTok"/>
+        </w:rPr>
+        <w:t xml:space="preserve"> </w:t>
+      </w:r>
+      <w:r>
+        <w:rPr>
+          <w:rStyle w:val="FloatTok"/>
+        </w:rPr>
+        <w:t xml:space="preserve">0.7</w:t>
+      </w:r>
+      <w:r>
+        <w:rPr>
+          <w:rStyle w:val="NormalTok"/>
+        </w:rPr>
+        <w:t xml:space="preserve">) </w:t>
+      </w:r>
+      <w:r>
+        <w:rPr>
+          <w:rStyle w:val="SpecialCharTok"/>
+        </w:rPr>
+        <w:t xml:space="preserve">+</w:t>
+      </w:r>
+      <w:r>
+        <w:br/>
+      </w:r>
+      <w:r>
+        <w:rPr>
+          <w:rStyle w:val="NormalTok"/>
+        </w:rPr>
+        <w:t xml:space="preserve">  </w:t>
+      </w:r>
+      <w:r>
+        <w:rPr>
+          <w:rStyle w:val="FunctionTok"/>
+        </w:rPr>
+        <w:t xml:space="preserve">geom_smooth</w:t>
+      </w:r>
+      <w:r>
+        <w:rPr>
+          <w:rStyle w:val="NormalTok"/>
+        </w:rPr>
+        <w:t xml:space="preserve">(</w:t>
+      </w:r>
+      <w:r>
+        <w:rPr>
+          <w:rStyle w:val="AttributeTok"/>
+        </w:rPr>
+        <w:t xml:space="preserve">method =</w:t>
+      </w:r>
+      <w:r>
+        <w:rPr>
+          <w:rStyle w:val="NormalTok"/>
+        </w:rPr>
+        <w:t xml:space="preserve"> </w:t>
+      </w:r>
+      <w:r>
+        <w:rPr>
+          <w:rStyle w:val="StringTok"/>
+        </w:rPr>
+        <w:t xml:space="preserve">"lm"</w:t>
+      </w:r>
+      <w:r>
+        <w:rPr>
+          <w:rStyle w:val="NormalTok"/>
+        </w:rPr>
+        <w:t xml:space="preserve">, </w:t>
+      </w:r>
+      <w:r>
+        <w:rPr>
+          <w:rStyle w:val="AttributeTok"/>
+        </w:rPr>
+        <w:t xml:space="preserve">se =</w:t>
+      </w:r>
+      <w:r>
+        <w:rPr>
+          <w:rStyle w:val="NormalTok"/>
+        </w:rPr>
+        <w:t xml:space="preserve"> </w:t>
+      </w:r>
+      <w:r>
+        <w:rPr>
+          <w:rStyle w:val="ConstantTok"/>
+        </w:rPr>
+        <w:t xml:space="preserve">TRUE</w:t>
+      </w:r>
+      <w:r>
+        <w:rPr>
+          <w:rStyle w:val="NormalTok"/>
+        </w:rPr>
+        <w:t xml:space="preserve">) </w:t>
+      </w:r>
+      <w:r>
+        <w:rPr>
+          <w:rStyle w:val="SpecialCharTok"/>
+        </w:rPr>
+        <w:t xml:space="preserve">+</w:t>
+      </w:r>
+      <w:r>
+        <w:br/>
+      </w:r>
+      <w:r>
+        <w:rPr>
+          <w:rStyle w:val="NormalTok"/>
+        </w:rPr>
+        <w:t xml:space="preserve">  </w:t>
+      </w:r>
+      <w:r>
+        <w:rPr>
+          <w:rStyle w:val="FunctionTok"/>
+        </w:rPr>
+        <w:t xml:space="preserve">labs</w:t>
+      </w:r>
+      <w:r>
+        <w:rPr>
+          <w:rStyle w:val="NormalTok"/>
+        </w:rPr>
+        <w:t xml:space="preserve">(</w:t>
+      </w:r>
+      <w:r>
+        <w:rPr>
+          <w:rStyle w:val="AttributeTok"/>
+        </w:rPr>
+        <w:t xml:space="preserve">x     =</w:t>
+      </w:r>
+      <w:r>
+        <w:rPr>
+          <w:rStyle w:val="NormalTok"/>
+        </w:rPr>
+        <w:t xml:space="preserve"> </w:t>
+      </w:r>
+      <w:r>
+        <w:rPr>
+          <w:rStyle w:val="StringTok"/>
+        </w:rPr>
+        <w:t xml:space="preserve">"Leaf width (cm)"</w:t>
+      </w:r>
+      <w:r>
+        <w:rPr>
+          <w:rStyle w:val="NormalTok"/>
+        </w:rPr>
+        <w:t xml:space="preserve">,</w:t>
+      </w:r>
+      <w:r>
+        <w:br/>
+      </w:r>
+      <w:r>
+        <w:rPr>
+          <w:rStyle w:val="NormalTok"/>
+        </w:rPr>
+        <w:t xml:space="preserve">       </w:t>
+      </w:r>
+      <w:r>
+        <w:rPr>
+          <w:rStyle w:val="AttributeTok"/>
+        </w:rPr>
+        <w:t xml:space="preserve">y     =</w:t>
+      </w:r>
+      <w:r>
+        <w:rPr>
+          <w:rStyle w:val="NormalTok"/>
+        </w:rPr>
+        <w:t xml:space="preserve"> </w:t>
+      </w:r>
+      <w:r>
+        <w:rPr>
+          <w:rStyle w:val="StringTok"/>
+        </w:rPr>
+        <w:t xml:space="preserve">"Leaf height (cm)"</w:t>
+      </w:r>
+      <w:r>
+        <w:rPr>
+          <w:rStyle w:val="NormalTok"/>
+        </w:rPr>
+        <w:t xml:space="preserve">,</w:t>
+      </w:r>
+      <w:r>
+        <w:br/>
+      </w:r>
+      <w:r>
+        <w:rPr>
+          <w:rStyle w:val="NormalTok"/>
+        </w:rPr>
+        <w:t xml:space="preserve">       </w:t>
+      </w:r>
+      <w:r>
+        <w:rPr>
+          <w:rStyle w:val="AttributeTok"/>
+        </w:rPr>
+        <w:t xml:space="preserve">color =</w:t>
+      </w:r>
+      <w:r>
+        <w:rPr>
+          <w:rStyle w:val="NormalTok"/>
+        </w:rPr>
+        <w:t xml:space="preserve"> </w:t>
+      </w:r>
+      <w:r>
+        <w:rPr>
+          <w:rStyle w:val="StringTok"/>
+        </w:rPr>
+        <w:t xml:space="preserve">"Side of tree"</w:t>
+      </w:r>
+      <w:r>
+        <w:rPr>
+          <w:rStyle w:val="NormalTok"/>
+        </w:rPr>
+        <w:t xml:space="preserve">,</w:t>
+      </w:r>
+      <w:r>
+        <w:br/>
+      </w:r>
+      <w:r>
+        <w:rPr>
+          <w:rStyle w:val="NormalTok"/>
+        </w:rPr>
+        <w:t xml:space="preserve">       </w:t>
+      </w:r>
+      <w:r>
+        <w:rPr>
+          <w:rStyle w:val="AttributeTok"/>
+        </w:rPr>
+        <w:t xml:space="preserve">title =</w:t>
+      </w:r>
+      <w:r>
+        <w:rPr>
+          <w:rStyle w:val="NormalTok"/>
+        </w:rPr>
+        <w:t xml:space="preserve"> </w:t>
+      </w:r>
+      <w:r>
+        <w:rPr>
+          <w:rStyle w:val="StringTok"/>
+        </w:rPr>
+        <w:t xml:space="preserve">"Leaf dimensions — sunny vs. shady"</w:t>
+      </w:r>
+      <w:r>
+        <w:rPr>
+          <w:rStyle w:val="NormalTok"/>
+        </w:rPr>
+        <w:t xml:space="preserve">) </w:t>
+      </w:r>
+      <w:r>
+        <w:rPr>
+          <w:rStyle w:val="SpecialCharTok"/>
+        </w:rPr>
+        <w:t xml:space="preserve">+</w:t>
+      </w:r>
+      <w:r>
+        <w:br/>
+      </w:r>
+      <w:r>
+        <w:rPr>
+          <w:rStyle w:val="NormalTok"/>
+        </w:rPr>
+        <w:t xml:space="preserve">  </w:t>
+      </w:r>
+      <w:r>
+        <w:rPr>
+          <w:rStyle w:val="FunctionTok"/>
+        </w:rPr>
+        <w:t xml:space="preserve">theme_bw</w:t>
+      </w:r>
+      <w:r>
+        <w:rPr>
+          <w:rStyle w:val="NormalTok"/>
+        </w:rPr>
+        <w:t xml:space="preserve">()</w:t>
+      </w:r>
+      <w:r>
+        <w:br/>
+      </w:r>
+      <w:r>
+        <w:br/>
+      </w:r>
+      <w:r>
+        <w:rPr>
+          <w:rStyle w:val="NormalTok"/>
+        </w:rPr>
+        <w:t xml:space="preserve">scatter_plot</w:t>
+      </w:r>
+    </w:p>
+    <w:p>
+      <w:pPr>
+        <w:pStyle w:val="FirstParagraph"/>
+      </w:pPr>
+      <w:r>
+        <w:t xml:space="preserve">Do the regression lines look similar for sunny and shady leaves? What does it mean if they have different slopes?</w:t>
+      </w:r>
+    </w:p>
+    <w:bookmarkEnd w:id="33"/>
+    <w:bookmarkStart w:id="34" w:name="faceted-histogram"/>
+    <w:p>
+      <w:pPr>
+        <w:pStyle w:val="Heading3"/>
+      </w:pPr>
+      <w:r>
+        <w:t xml:space="preserve">Faceted histogram</w:t>
+      </w:r>
+    </w:p>
+    <w:p>
+      <w:pPr>
+        <w:pStyle w:val="SourceCode"/>
+      </w:pPr>
+      <w:r>
+        <w:rPr>
+          <w:rStyle w:val="FunctionTok"/>
+        </w:rPr>
+        <w:t xml:space="preserve">ggplot</w:t>
+      </w:r>
+      <w:r>
+        <w:rPr>
+          <w:rStyle w:val="NormalTok"/>
+        </w:rPr>
+        <w:t xml:space="preserve">(leaf_df, </w:t>
+      </w:r>
+      <w:r>
+        <w:rPr>
+          <w:rStyle w:val="FunctionTok"/>
+        </w:rPr>
+        <w:t xml:space="preserve">aes</w:t>
+      </w:r>
+      <w:r>
+        <w:rPr>
+          <w:rStyle w:val="NormalTok"/>
+        </w:rPr>
+        <w:t xml:space="preserve">(</w:t>
+      </w:r>
+      <w:r>
+        <w:rPr>
+          <w:rStyle w:val="AttributeTok"/>
+        </w:rPr>
+        <w:t xml:space="preserve">x =</w:t>
+      </w:r>
+      <w:r>
+        <w:rPr>
+          <w:rStyle w:val="NormalTok"/>
+        </w:rPr>
+        <w:t xml:space="preserve"> weight_g, </w:t>
+      </w:r>
+      <w:r>
+        <w:rPr>
+          <w:rStyle w:val="AttributeTok"/>
+        </w:rPr>
+        <w:t xml:space="preserve">fill =</w:t>
+      </w:r>
+      <w:r>
+        <w:rPr>
+          <w:rStyle w:val="NormalTok"/>
+        </w:rPr>
+        <w:t xml:space="preserve"> side)) </w:t>
+      </w:r>
+      <w:r>
+        <w:rPr>
+          <w:rStyle w:val="SpecialCharTok"/>
+        </w:rPr>
+        <w:t xml:space="preserve">+</w:t>
+      </w:r>
+      <w:r>
+        <w:br/>
+      </w:r>
+      <w:r>
+        <w:rPr>
+          <w:rStyle w:val="NormalTok"/>
+        </w:rPr>
+        <w:t xml:space="preserve">  </w:t>
+      </w:r>
+      <w:r>
+        <w:rPr>
+          <w:rStyle w:val="FunctionTok"/>
+        </w:rPr>
+        <w:t xml:space="preserve">geom_histogram</w:t>
+      </w:r>
+      <w:r>
+        <w:rPr>
+          <w:rStyle w:val="NormalTok"/>
+        </w:rPr>
+        <w:t xml:space="preserve">(</w:t>
+      </w:r>
+      <w:r>
+        <w:rPr>
+          <w:rStyle w:val="AttributeTok"/>
+        </w:rPr>
+        <w:t xml:space="preserve">binwidth =</w:t>
+      </w:r>
+      <w:r>
+        <w:rPr>
+          <w:rStyle w:val="NormalTok"/>
+        </w:rPr>
+        <w:t xml:space="preserve"> </w:t>
+      </w:r>
+      <w:r>
+        <w:rPr>
+          <w:rStyle w:val="FloatTok"/>
+        </w:rPr>
+        <w:t xml:space="preserve">0.5</w:t>
+      </w:r>
+      <w:r>
+        <w:rPr>
+          <w:rStyle w:val="NormalTok"/>
+        </w:rPr>
+        <w:t xml:space="preserve">, </w:t>
+      </w:r>
+      <w:r>
+        <w:rPr>
+          <w:rStyle w:val="AttributeTok"/>
+        </w:rPr>
+        <w:t xml:space="preserve">color =</w:t>
+      </w:r>
+      <w:r>
+        <w:rPr>
+          <w:rStyle w:val="NormalTok"/>
+        </w:rPr>
+        <w:t xml:space="preserve"> </w:t>
+      </w:r>
+      <w:r>
+        <w:rPr>
+          <w:rStyle w:val="StringTok"/>
+        </w:rPr>
+        <w:t xml:space="preserve">"white"</w:t>
+      </w:r>
+      <w:r>
+        <w:rPr>
+          <w:rStyle w:val="NormalTok"/>
+        </w:rPr>
+        <w:t xml:space="preserve">, </w:t>
+      </w:r>
+      <w:r>
+        <w:rPr>
+          <w:rStyle w:val="AttributeTok"/>
+        </w:rPr>
+        <w:t xml:space="preserve">alpha =</w:t>
+      </w:r>
+      <w:r>
+        <w:rPr>
+          <w:rStyle w:val="NormalTok"/>
+        </w:rPr>
+        <w:t xml:space="preserve"> </w:t>
+      </w:r>
+      <w:r>
+        <w:rPr>
+          <w:rStyle w:val="FloatTok"/>
+        </w:rPr>
+        <w:t xml:space="preserve">0.8</w:t>
+      </w:r>
+      <w:r>
+        <w:rPr>
+          <w:rStyle w:val="NormalTok"/>
+        </w:rPr>
+        <w:t xml:space="preserve">) </w:t>
+      </w:r>
+      <w:r>
+        <w:rPr>
+          <w:rStyle w:val="SpecialCharTok"/>
+        </w:rPr>
+        <w:t xml:space="preserve">+</w:t>
+      </w:r>
+      <w:r>
+        <w:br/>
+      </w:r>
+      <w:r>
+        <w:rPr>
+          <w:rStyle w:val="NormalTok"/>
+        </w:rPr>
+        <w:t xml:space="preserve">  </w:t>
+      </w:r>
+      <w:r>
+        <w:rPr>
+          <w:rStyle w:val="FunctionTok"/>
+        </w:rPr>
+        <w:t xml:space="preserve">facet_wrap</w:t>
+      </w:r>
+      <w:r>
+        <w:rPr>
+          <w:rStyle w:val="NormalTok"/>
+        </w:rPr>
+        <w:t xml:space="preserve">(</w:t>
+      </w:r>
+      <w:r>
+        <w:rPr>
+          <w:rStyle w:val="SpecialCharTok"/>
+        </w:rPr>
+        <w:t xml:space="preserve">~</w:t>
+      </w:r>
+      <w:r>
+        <w:rPr>
+          <w:rStyle w:val="NormalTok"/>
+        </w:rPr>
+        <w:t xml:space="preserve">side, </w:t>
+      </w:r>
+      <w:r>
+        <w:rPr>
+          <w:rStyle w:val="AttributeTok"/>
+        </w:rPr>
+        <w:t xml:space="preserve">ncol =</w:t>
+      </w:r>
+      <w:r>
+        <w:rPr>
+          <w:rStyle w:val="NormalTok"/>
+        </w:rPr>
+        <w:t xml:space="preserve"> </w:t>
+      </w:r>
+      <w:r>
+        <w:rPr>
+          <w:rStyle w:val="DecValTok"/>
+        </w:rPr>
+        <w:t xml:space="preserve">1</w:t>
+      </w:r>
+      <w:r>
+        <w:rPr>
+          <w:rStyle w:val="NormalTok"/>
+        </w:rPr>
+        <w:t xml:space="preserve">) </w:t>
+      </w:r>
+      <w:r>
+        <w:rPr>
+          <w:rStyle w:val="SpecialCharTok"/>
+        </w:rPr>
+        <w:t xml:space="preserve">+</w:t>
+      </w:r>
+      <w:r>
+        <w:br/>
+      </w:r>
+      <w:r>
+        <w:rPr>
+          <w:rStyle w:val="NormalTok"/>
+        </w:rPr>
+        <w:t xml:space="preserve">  </w:t>
+      </w:r>
+      <w:r>
+        <w:rPr>
+          <w:rStyle w:val="FunctionTok"/>
+        </w:rPr>
+        <w:t xml:space="preserve">labs</w:t>
+      </w:r>
+      <w:r>
+        <w:rPr>
+          <w:rStyle w:val="NormalTok"/>
+        </w:rPr>
+        <w:t xml:space="preserve">(</w:t>
+      </w:r>
+      <w:r>
+        <w:rPr>
+          <w:rStyle w:val="AttributeTok"/>
+        </w:rPr>
+        <w:t xml:space="preserve">x =</w:t>
+      </w:r>
+      <w:r>
+        <w:rPr>
+          <w:rStyle w:val="NormalTok"/>
+        </w:rPr>
+        <w:t xml:space="preserve"> </w:t>
+      </w:r>
+      <w:r>
+        <w:rPr>
+          <w:rStyle w:val="StringTok"/>
+        </w:rPr>
+        <w:t xml:space="preserve">"Leaf weight (g)"</w:t>
+      </w:r>
+      <w:r>
+        <w:rPr>
+          <w:rStyle w:val="NormalTok"/>
+        </w:rPr>
+        <w:t xml:space="preserve">, </w:t>
+      </w:r>
+      <w:r>
+        <w:rPr>
+          <w:rStyle w:val="AttributeTok"/>
+        </w:rPr>
+        <w:t xml:space="preserve">y =</w:t>
+      </w:r>
+      <w:r>
+        <w:rPr>
+          <w:rStyle w:val="NormalTok"/>
+        </w:rPr>
+        <w:t xml:space="preserve"> </w:t>
+      </w:r>
+      <w:r>
+        <w:rPr>
+          <w:rStyle w:val="StringTok"/>
+        </w:rPr>
+        <w:t xml:space="preserve">"Count"</w:t>
+      </w:r>
+      <w:r>
+        <w:rPr>
+          <w:rStyle w:val="NormalTok"/>
+        </w:rPr>
+        <w:t xml:space="preserve">,</w:t>
+      </w:r>
+      <w:r>
+        <w:br/>
+      </w:r>
+      <w:r>
+        <w:rPr>
+          <w:rStyle w:val="NormalTok"/>
+        </w:rPr>
+        <w:t xml:space="preserve">       </w:t>
+      </w:r>
+      <w:r>
+        <w:rPr>
+          <w:rStyle w:val="AttributeTok"/>
+        </w:rPr>
+        <w:t xml:space="preserve">title =</w:t>
+      </w:r>
+      <w:r>
+        <w:rPr>
+          <w:rStyle w:val="NormalTok"/>
+        </w:rPr>
+        <w:t xml:space="preserve"> </w:t>
+      </w:r>
+      <w:r>
+        <w:rPr>
+          <w:rStyle w:val="StringTok"/>
+        </w:rPr>
+        <w:t xml:space="preserve">"Distribution of leaf weight by side"</w:t>
+      </w:r>
+      <w:r>
+        <w:rPr>
+          <w:rStyle w:val="NormalTok"/>
+        </w:rPr>
+        <w:t xml:space="preserve">) </w:t>
+      </w:r>
+      <w:r>
+        <w:rPr>
+          <w:rStyle w:val="SpecialCharTok"/>
+        </w:rPr>
+        <w:t xml:space="preserve">+</w:t>
+      </w:r>
+      <w:r>
+        <w:br/>
+      </w:r>
+      <w:r>
+        <w:rPr>
+          <w:rStyle w:val="NormalTok"/>
+        </w:rPr>
+        <w:t xml:space="preserve">  </w:t>
+      </w:r>
+      <w:r>
+        <w:rPr>
+          <w:rStyle w:val="FunctionTok"/>
+        </w:rPr>
+        <w:t xml:space="preserve">theme_minimal</w:t>
+      </w:r>
+      <w:r>
+        <w:rPr>
+          <w:rStyle w:val="NormalTok"/>
+        </w:rPr>
+        <w:t xml:space="preserve">() </w:t>
+      </w:r>
+      <w:r>
+        <w:rPr>
+          <w:rStyle w:val="SpecialCharTok"/>
+        </w:rPr>
+        <w:t xml:space="preserve">+</w:t>
+      </w:r>
+      <w:r>
+        <w:br/>
+      </w:r>
+      <w:r>
+        <w:rPr>
+          <w:rStyle w:val="NormalTok"/>
+        </w:rPr>
+        <w:t xml:space="preserve">  </w:t>
+      </w:r>
+      <w:r>
+        <w:rPr>
+          <w:rStyle w:val="FunctionTok"/>
+        </w:rPr>
+        <w:t xml:space="preserve">theme</w:t>
+      </w:r>
+      <w:r>
+        <w:rPr>
+          <w:rStyle w:val="NormalTok"/>
+        </w:rPr>
+        <w:t xml:space="preserve">(</w:t>
+      </w:r>
+      <w:r>
+        <w:rPr>
+          <w:rStyle w:val="AttributeTok"/>
+        </w:rPr>
+        <w:t xml:space="preserve">legend.position =</w:t>
+      </w:r>
+      <w:r>
+        <w:rPr>
+          <w:rStyle w:val="NormalTok"/>
+        </w:rPr>
+        <w:t xml:space="preserve"> </w:t>
+      </w:r>
+      <w:r>
+        <w:rPr>
+          <w:rStyle w:val="StringTok"/>
+        </w:rPr>
+        <w:t xml:space="preserve">"none"</w:t>
+      </w:r>
+      <w:r>
+        <w:rPr>
+          <w:rStyle w:val="NormalTok"/>
+        </w:rPr>
+        <w:t xml:space="preserve">)</w:t>
+      </w:r>
+    </w:p>
+    <w:p>
+      <w:pPr>
+        <w:pStyle w:val="FirstParagraph"/>
+      </w:pPr>
+      <w:r>
+        <w:t xml:space="preserve">Do the two distributions look roughly bell-shaped or skewed? Are they similar in spread? These observations will matter when we choose a statistical test later in the semester.</w:t>
+      </w:r>
+    </w:p>
+    <w:p>
+      <w:r>
+        <w:pict>
+          <v:rect style="width:0;height:1.5pt" o:hralign="center" o:hrstd="t" o:hr="t"/>
+        </w:pict>
+      </w:r>
+    </w:p>
+    <w:p>
+      <w:pPr>
+        <w:pStyle w:val="FirstParagraph"/>
+      </w:pPr>
+      <w:r>
+        <w:rPr>
+          <w:i/>
+          <w:iCs/>
+        </w:rPr>
+        <w:t xml:space="preserve">Data collected by BIOL 3810 students, University of Minnesota Duluth. Lectures 01–02 and Worksheets 01–02 cover all skills needed for this assignment.</w:t>
+      </w:r>
+    </w:p>
+    <w:bookmarkEnd w:id="34"/>
+    <w:bookmarkEnd w:id="35"/>
     <w:sectPr>
       <w:pgSz w:h="15840" w:w="12240"/>
       <w:pgMar w:bottom="1440" w:footer="720" w:gutter="0" w:header="720" w:left="1440" w:right="1440" w:top="1440"/>
@@ -369,85 +4752,179 @@
       </w:pPr>
     </w:lvl>
   </w:abstractNum>
-  <w:abstractNum w:abstractNumId="99411">
-    <w:nsid w:val="00A99411"/>
+  <w:abstractNum w:abstractNumId="991">
+    <w:nsid w:val="0000A991"/>
     <w:multiLevelType w:val="multilevel"/>
     <w:lvl w:ilvl="0">
-      <w:start w:val="1"/>
-      <w:numFmt w:val="decimal"/>
-      <w:lvlText w:val="%1."/>
+      <w:numFmt w:val="bullet"/>
+      <w:lvlText w:val=""/>
       <w:lvlJc w:val="left"/>
       <w:pPr>
         <w:ind w:left="720" w:hanging="360"/>
       </w:pPr>
+      <w:rPr>
+        <w:rFonts w:ascii="Symbol" w:hAnsi="Symbol" w:cs="Symbol" w:hint="default"/>
+      </w:rPr>
     </w:lvl>
     <w:lvl w:ilvl="1">
-      <w:start w:val="1"/>
-      <w:numFmt w:val="decimal"/>
-      <w:lvlText w:val="%2."/>
+      <w:numFmt w:val="bullet"/>
+      <w:lvlText w:val="o"/>
       <w:lvlJc w:val="left"/>
       <w:pPr>
         <w:ind w:left="1440" w:hanging="360"/>
       </w:pPr>
+      <w:rPr>
+        <w:rFonts w:ascii="Courier New" w:hAnsi="Courier New" w:cs="Courier New" w:hint="default"/>
+      </w:rPr>
     </w:lvl>
     <w:lvl w:ilvl="2">
-      <w:start w:val="1"/>
-      <w:numFmt w:val="decimal"/>
-      <w:lvlText w:val="%3."/>
+      <w:numFmt w:val="bullet"/>
+      <w:lvlText w:val=""/>
       <w:lvlJc w:val="left"/>
       <w:pPr>
         <w:ind w:left="2160" w:hanging="360"/>
       </w:pPr>
+      <w:rPr>
+        <w:rFonts w:ascii="Wingdings" w:hAnsi="Wingdings" w:cs="Wingdings" w:hint="default"/>
+      </w:rPr>
     </w:lvl>
     <w:lvl w:ilvl="3">
-      <w:start w:val="1"/>
-      <w:numFmt w:val="decimal"/>
-      <w:lvlText w:val="%4."/>
+      <w:numFmt w:val="bullet"/>
+      <w:lvlText w:val=""/>
       <w:lvlJc w:val="left"/>
       <w:pPr>
         <w:ind w:left="2880" w:hanging="360"/>
       </w:pPr>
+      <w:rPr>
+        <w:rFonts w:ascii="Symbol" w:hAnsi="Symbol" w:cs="Symbol" w:hint="default"/>
+      </w:rPr>
     </w:lvl>
     <w:lvl w:ilvl="4">
-      <w:start w:val="1"/>
-      <w:numFmt w:val="decimal"/>
-      <w:lvlText w:val="%5."/>
+      <w:numFmt w:val="bullet"/>
+      <w:lvlText w:val="o"/>
       <w:lvlJc w:val="left"/>
       <w:pPr>
         <w:ind w:left="3600" w:hanging="360"/>
       </w:pPr>
+      <w:rPr>
+        <w:rFonts w:ascii="Courier New" w:hAnsi="Courier New" w:cs="Courier New" w:hint="default"/>
+      </w:rPr>
     </w:lvl>
     <w:lvl w:ilvl="5">
-      <w:start w:val="1"/>
-      <w:numFmt w:val="decimal"/>
-      <w:lvlText w:val="%6."/>
+      <w:numFmt w:val="bullet"/>
+      <w:lvlText w:val=""/>
       <w:lvlJc w:val="left"/>
       <w:pPr>
         <w:ind w:left="4320" w:hanging="360"/>
       </w:pPr>
+      <w:rPr>
+        <w:rFonts w:ascii="Wingdings" w:hAnsi="Wingdings" w:cs="Wingdings" w:hint="default"/>
+      </w:rPr>
     </w:lvl>
     <w:lvl w:ilvl="6">
-      <w:start w:val="1"/>
-      <w:numFmt w:val="decimal"/>
-      <w:lvlText w:val="%7."/>
+      <w:numFmt w:val="bullet"/>
+      <w:lvlText w:val=""/>
       <w:lvlJc w:val="left"/>
       <w:pPr>
         <w:ind w:left="5040" w:hanging="360"/>
       </w:pPr>
+      <w:rPr>
+        <w:rFonts w:ascii="Symbol" w:hAnsi="Symbol" w:cs="Symbol" w:hint="default"/>
+      </w:rPr>
     </w:lvl>
     <w:lvl w:ilvl="7">
-      <w:start w:val="1"/>
-      <w:numFmt w:val="decimal"/>
-      <w:lvlText w:val="%8."/>
+      <w:numFmt w:val="bullet"/>
+      <w:lvlText w:val="o"/>
       <w:lvlJc w:val="left"/>
       <w:pPr>
         <w:ind w:left="5760" w:hanging="360"/>
       </w:pPr>
+      <w:rPr>
+        <w:rFonts w:ascii="Courier New" w:hAnsi="Courier New" w:cs="Courier New" w:hint="default"/>
+      </w:rPr>
     </w:lvl>
     <w:lvl w:ilvl="8">
-      <w:start w:val="1"/>
-      <w:numFmt w:val="decimal"/>
-      <w:lvlText w:val="%9."/>
+      <w:numFmt w:val="bullet"/>
+      <w:lvlText w:val=""/>
+      <w:lvlJc w:val="left"/>
+      <w:pPr>
+        <w:ind w:left="6480" w:hanging="360"/>
+      </w:pPr>
+      <w:rPr>
+        <w:rFonts w:ascii="Wingdings" w:hAnsi="Wingdings" w:cs="Wingdings" w:hint="default"/>
+      </w:rPr>
+    </w:lvl>
+  </w:abstractNum>
+  <w:abstractNum w:abstractNumId="992">
+    <w:nsid w:val="0000A992"/>
+    <w:multiLevelType w:val="multilevel"/>
+    <w:lvl w:ilvl="0">
+      <w:numFmt w:val="bullet"/>
+      <w:lvlText w:val="☐"/>
+      <w:lvlJc w:val="left"/>
+      <w:pPr>
+        <w:ind w:left="720" w:hanging="360"/>
+      </w:pPr>
+    </w:lvl>
+    <w:lvl w:ilvl="1">
+      <w:numFmt w:val="bullet"/>
+      <w:lvlText w:val="☐"/>
+      <w:lvlJc w:val="left"/>
+      <w:pPr>
+        <w:ind w:left="1440" w:hanging="360"/>
+      </w:pPr>
+    </w:lvl>
+    <w:lvl w:ilvl="2">
+      <w:numFmt w:val="bullet"/>
+      <w:lvlText w:val="☐"/>
+      <w:lvlJc w:val="left"/>
+      <w:pPr>
+        <w:ind w:left="2160" w:hanging="360"/>
+      </w:pPr>
+    </w:lvl>
+    <w:lvl w:ilvl="3">
+      <w:numFmt w:val="bullet"/>
+      <w:lvlText w:val="☐"/>
+      <w:lvlJc w:val="left"/>
+      <w:pPr>
+        <w:ind w:left="2880" w:hanging="360"/>
+      </w:pPr>
+    </w:lvl>
+    <w:lvl w:ilvl="4">
+      <w:numFmt w:val="bullet"/>
+      <w:lvlText w:val="☐"/>
+      <w:lvlJc w:val="left"/>
+      <w:pPr>
+        <w:ind w:left="3600" w:hanging="360"/>
+      </w:pPr>
+    </w:lvl>
+    <w:lvl w:ilvl="5">
+      <w:numFmt w:val="bullet"/>
+      <w:lvlText w:val="☐"/>
+      <w:lvlJc w:val="left"/>
+      <w:pPr>
+        <w:ind w:left="4320" w:hanging="360"/>
+      </w:pPr>
+    </w:lvl>
+    <w:lvl w:ilvl="6">
+      <w:numFmt w:val="bullet"/>
+      <w:lvlText w:val="☐"/>
+      <w:lvlJc w:val="left"/>
+      <w:pPr>
+        <w:ind w:left="5040" w:hanging="360"/>
+      </w:pPr>
+    </w:lvl>
+    <w:lvl w:ilvl="7">
+      <w:numFmt w:val="bullet"/>
+      <w:lvlText w:val="☐"/>
+      <w:lvlJc w:val="left"/>
+      <w:pPr>
+        <w:ind w:left="5760" w:hanging="360"/>
+      </w:pPr>
+    </w:lvl>
+    <w:lvl w:ilvl="8">
+      <w:numFmt w:val="bullet"/>
+      <w:lvlText w:val="☐"/>
       <w:lvlJc w:val="left"/>
       <w:pPr>
         <w:ind w:left="6480" w:hanging="360"/>
@@ -458,64 +4935,22 @@
     <w:abstractNumId w:val="990"/>
   </w:num>
   <w:num w:numId="1001">
-    <w:abstractNumId w:val="99411"/>
-    <w:lvlOverride w:ilvl="0">
-      <w:startOverride w:val="1"/>
-    </w:lvlOverride>
-    <w:lvlOverride w:ilvl="1">
-      <w:startOverride w:val="1"/>
-    </w:lvlOverride>
-    <w:lvlOverride w:ilvl="2">
-      <w:startOverride w:val="1"/>
-    </w:lvlOverride>
-    <w:lvlOverride w:ilvl="3">
-      <w:startOverride w:val="1"/>
-    </w:lvlOverride>
-    <w:lvlOverride w:ilvl="4">
-      <w:startOverride w:val="1"/>
-    </w:lvlOverride>
-    <w:lvlOverride w:ilvl="5">
-      <w:startOverride w:val="1"/>
-    </w:lvlOverride>
-    <w:lvlOverride w:ilvl="6">
-      <w:startOverride w:val="1"/>
-    </w:lvlOverride>
-    <w:lvlOverride w:ilvl="7">
-      <w:startOverride w:val="1"/>
-    </w:lvlOverride>
-    <w:lvlOverride w:ilvl="8">
-      <w:startOverride w:val="1"/>
-    </w:lvlOverride>
+    <w:abstractNumId w:val="991"/>
   </w:num>
   <w:num w:numId="1002">
-    <w:abstractNumId w:val="99411"/>
-    <w:lvlOverride w:ilvl="0">
-      <w:startOverride w:val="1"/>
-    </w:lvlOverride>
-    <w:lvlOverride w:ilvl="1">
-      <w:startOverride w:val="1"/>
-    </w:lvlOverride>
-    <w:lvlOverride w:ilvl="2">
-      <w:startOverride w:val="1"/>
-    </w:lvlOverride>
-    <w:lvlOverride w:ilvl="3">
-      <w:startOverride w:val="1"/>
-    </w:lvlOverride>
-    <w:lvlOverride w:ilvl="4">
-      <w:startOverride w:val="1"/>
-    </w:lvlOverride>
-    <w:lvlOverride w:ilvl="5">
-      <w:startOverride w:val="1"/>
-    </w:lvlOverride>
-    <w:lvlOverride w:ilvl="6">
-      <w:startOverride w:val="1"/>
-    </w:lvlOverride>
-    <w:lvlOverride w:ilvl="7">
-      <w:startOverride w:val="1"/>
-    </w:lvlOverride>
-    <w:lvlOverride w:ilvl="8">
-      <w:startOverride w:val="1"/>
-    </w:lvlOverride>
+    <w:abstractNumId w:val="992"/>
+  </w:num>
+  <w:num w:numId="1003">
+    <w:abstractNumId w:val="992"/>
+  </w:num>
+  <w:num w:numId="1004">
+    <w:abstractNumId w:val="992"/>
+  </w:num>
+  <w:num w:numId="1005">
+    <w:abstractNumId w:val="992"/>
+  </w:num>
+  <w:num w:numId="1006">
+    <w:abstractNumId w:val="992"/>
   </w:num>
 </w:numbering>
 </file>

</xml_diff>